<commit_message>
Biology complete — all 9 sub-strands, 8 lessons each
Sub-strands: 1.1, 1.2, 1.3, 1.4, 2.1, 2.2, 2.3, 3.1, 3.2, 3.3
Each: lesson sequence + Final Explanation + Summary Table
72 lessons total (8 per new sub-strand + existing)

Tooling added:
- scripts/patch_lesson.js — node-based lesson patcher
- scripts/patch_fe.js — node-based FE patcher
- scripts/repair_stubs.py — batch stub repair utility
- scripts/patch_batch_mode.py — batch API support
</commit_message>
<xml_diff>
--- a/data/outputs/docx/Grade 10 Biology/Bio 1.2/Biology_Specimen_Collection_and_Preservation_CBE_LessonSequence.docx
+++ b/data/outputs/docx/Grade 10 Biology/Bio 1.2/Biology_Specimen_Collection_and_Preservation_CBE_LessonSequence.docx
@@ -3427,7 +3427,7 @@
             <w:pPr>
               <w:spacing w:after="20" w:before="0"/>
             </w:pPr>
-            <w:hyperlink w:history="1" r:id="rIdbt-hucpf8ncccvmf5-gow">
+            <w:hyperlink w:history="1" r:id="rId-h12k034tt9pclku0uf9f">
               <w:r>
                 <w:rPr>
                   <w:rFonts w:ascii="Arial" w:cs="Arial" w:eastAsia="Arial" w:hAnsi="Arial"/>
@@ -3460,7 +3460,7 @@
               <w:spacing w:after="10" w:before="0"/>
               <w:ind w:left="120"/>
             </w:pPr>
-            <w:hyperlink w:history="1" r:id="rIdsdfsyi5gocblyddd7e4uy">
+            <w:hyperlink w:history="1" r:id="rId5ivhqrhrahft8g_d_vsvz">
               <w:r>
                 <w:rPr>
                   <w:rFonts w:ascii="Arial" w:cs="Arial" w:eastAsia="Arial" w:hAnsi="Arial"/>
@@ -3505,7 +3505,7 @@
             <w:pPr>
               <w:spacing w:after="20" w:before="0"/>
             </w:pPr>
-            <w:hyperlink w:history="1" r:id="rId4qgapyoxqzghntlxiokyq">
+            <w:hyperlink w:history="1" r:id="rIdv7aurbmhbnska6ygaciem">
               <w:r>
                 <w:rPr>
                   <w:rFonts w:ascii="Arial" w:cs="Arial" w:eastAsia="Arial" w:hAnsi="Arial"/>
@@ -3538,7 +3538,7 @@
               <w:spacing w:after="10" w:before="0"/>
               <w:ind w:left="120"/>
             </w:pPr>
-            <w:hyperlink w:history="1" r:id="rIdx8x-zot4bziziozlrslka">
+            <w:hyperlink w:history="1" r:id="rIdsgn_v-6-cfkfrrxobkprs">
               <w:r>
                 <w:rPr>
                   <w:rFonts w:ascii="Arial" w:cs="Arial" w:eastAsia="Arial" w:hAnsi="Arial"/>
@@ -3746,7 +3746,7 @@
             <w:pPr>
               <w:spacing w:after="20" w:before="0"/>
             </w:pPr>
-            <w:hyperlink w:history="1" r:id="rIde5sve7na7mervvji9bfcn">
+            <w:hyperlink w:history="1" r:id="rIdtm37qp4l9cadmjrqwsb3i">
               <w:r>
                 <w:rPr>
                   <w:rFonts w:ascii="Arial" w:cs="Arial" w:eastAsia="Arial" w:hAnsi="Arial"/>
@@ -3779,7 +3779,7 @@
               <w:spacing w:after="10" w:before="0"/>
               <w:ind w:left="120"/>
             </w:pPr>
-            <w:hyperlink w:history="1" r:id="rIdn9vbmdl9cc4yvhdilc3yo">
+            <w:hyperlink w:history="1" r:id="rIdxnjxhbvuks6rtz5pfjlze">
               <w:r>
                 <w:rPr>
                   <w:rFonts w:ascii="Arial" w:cs="Arial" w:eastAsia="Arial" w:hAnsi="Arial"/>
@@ -3824,7 +3824,7 @@
             <w:pPr>
               <w:spacing w:after="20" w:before="0"/>
             </w:pPr>
-            <w:hyperlink w:history="1" r:id="rIdmikibjifw8rjurqcfrpo6">
+            <w:hyperlink w:history="1" r:id="rIdf7ituicsjnklkux3fusdg">
               <w:r>
                 <w:rPr>
                   <w:rFonts w:ascii="Arial" w:cs="Arial" w:eastAsia="Arial" w:hAnsi="Arial"/>
@@ -3857,7 +3857,7 @@
               <w:spacing w:after="10" w:before="0"/>
               <w:ind w:left="120"/>
             </w:pPr>
-            <w:hyperlink w:history="1" r:id="rIdiftuwht1sx5wdevcr-ywy">
+            <w:hyperlink w:history="1" r:id="rIdsjbafywisbfiz07y2sogc">
               <w:r>
                 <w:rPr>
                   <w:rFonts w:ascii="Arial" w:cs="Arial" w:eastAsia="Arial" w:hAnsi="Arial"/>
@@ -4065,7 +4065,7 @@
             <w:pPr>
               <w:spacing w:after="20" w:before="0"/>
             </w:pPr>
-            <w:hyperlink w:history="1" r:id="rIdcrx6hxmijtn7h8ehrtrqu">
+            <w:hyperlink w:history="1" r:id="rId_o-iih0cqovl4vkhkrcqh">
               <w:r>
                 <w:rPr>
                   <w:rFonts w:ascii="Arial" w:cs="Arial" w:eastAsia="Arial" w:hAnsi="Arial"/>
@@ -4098,7 +4098,7 @@
               <w:spacing w:after="10" w:before="0"/>
               <w:ind w:left="120"/>
             </w:pPr>
-            <w:hyperlink w:history="1" r:id="rIdycyqmjzxy10mbotvaprqn">
+            <w:hyperlink w:history="1" r:id="rIdnpmsav3m2axru8e-9ix4a">
               <w:r>
                 <w:rPr>
                   <w:rFonts w:ascii="Arial" w:cs="Arial" w:eastAsia="Arial" w:hAnsi="Arial"/>
@@ -4143,7 +4143,7 @@
             <w:pPr>
               <w:spacing w:after="20" w:before="0"/>
             </w:pPr>
-            <w:hyperlink w:history="1" r:id="rIdqxylo_ezboeokurqzrwtt">
+            <w:hyperlink w:history="1" r:id="rIdoeuqn8csbivzfqa6fbyjs">
               <w:r>
                 <w:rPr>
                   <w:rFonts w:ascii="Arial" w:cs="Arial" w:eastAsia="Arial" w:hAnsi="Arial"/>
@@ -4176,7 +4176,7 @@
               <w:spacing w:after="10" w:before="0"/>
               <w:ind w:left="120"/>
             </w:pPr>
-            <w:hyperlink w:history="1" r:id="rIdkf_gr9pmjmovbg7-x4beq">
+            <w:hyperlink w:history="1" r:id="rIdyvbykp8pgywaridxqcjuj">
               <w:r>
                 <w:rPr>
                   <w:rFonts w:ascii="Arial" w:cs="Arial" w:eastAsia="Arial" w:hAnsi="Arial"/>
@@ -4384,7 +4384,7 @@
             <w:pPr>
               <w:spacing w:after="20" w:before="0"/>
             </w:pPr>
-            <w:hyperlink w:history="1" r:id="rIdzlm_rsilbpjrfeq-fqqbl">
+            <w:hyperlink w:history="1" r:id="rIdiafzvv9g1hi9fr52ajh2k">
               <w:r>
                 <w:rPr>
                   <w:rFonts w:ascii="Arial" w:cs="Arial" w:eastAsia="Arial" w:hAnsi="Arial"/>
@@ -4417,7 +4417,7 @@
               <w:spacing w:after="10" w:before="0"/>
               <w:ind w:left="120"/>
             </w:pPr>
-            <w:hyperlink w:history="1" r:id="rId3rmvntkvkyxcr1wcxg-io">
+            <w:hyperlink w:history="1" r:id="rId6gwcozttdi_l19msan1of">
               <w:r>
                 <w:rPr>
                   <w:rFonts w:ascii="Arial" w:cs="Arial" w:eastAsia="Arial" w:hAnsi="Arial"/>
@@ -4462,7 +4462,7 @@
             <w:pPr>
               <w:spacing w:after="20" w:before="0"/>
             </w:pPr>
-            <w:hyperlink w:history="1" r:id="rIdrw_wdxrbd3it2gtyduwnc">
+            <w:hyperlink w:history="1" r:id="rIduvxjokw5ya5s3ly8xkcmy">
               <w:r>
                 <w:rPr>
                   <w:rFonts w:ascii="Arial" w:cs="Arial" w:eastAsia="Arial" w:hAnsi="Arial"/>
@@ -4495,7 +4495,7 @@
               <w:spacing w:after="10" w:before="0"/>
               <w:ind w:left="120"/>
             </w:pPr>
-            <w:hyperlink w:history="1" r:id="rIdn0ypho_nq6nm5-xojbbem">
+            <w:hyperlink w:history="1" r:id="rIdh520stbr7kgqh-nvc2--k">
               <w:r>
                 <w:rPr>
                   <w:rFonts w:ascii="Arial" w:cs="Arial" w:eastAsia="Arial" w:hAnsi="Arial"/>
@@ -4703,7 +4703,7 @@
             <w:pPr>
               <w:spacing w:after="20" w:before="0"/>
             </w:pPr>
-            <w:hyperlink w:history="1" r:id="rIdtgnbw49jlmhus0c_fesh_">
+            <w:hyperlink w:history="1" r:id="rIdatlfnqg06rfiwpj6sj4pd">
               <w:r>
                 <w:rPr>
                   <w:rFonts w:ascii="Arial" w:cs="Arial" w:eastAsia="Arial" w:hAnsi="Arial"/>
@@ -4736,7 +4736,7 @@
               <w:spacing w:after="10" w:before="0"/>
               <w:ind w:left="120"/>
             </w:pPr>
-            <w:hyperlink w:history="1" r:id="rId4uyieqh4inialv778nxzc">
+            <w:hyperlink w:history="1" r:id="rIdqzswygbgijsryheurriqy">
               <w:r>
                 <w:rPr>
                   <w:rFonts w:ascii="Arial" w:cs="Arial" w:eastAsia="Arial" w:hAnsi="Arial"/>
@@ -4781,7 +4781,7 @@
             <w:pPr>
               <w:spacing w:after="20" w:before="0"/>
             </w:pPr>
-            <w:hyperlink w:history="1" r:id="rIdvhypmab_zryofc9akljpc">
+            <w:hyperlink w:history="1" r:id="rIdfee0bxzhrkv_pkypostk3">
               <w:r>
                 <w:rPr>
                   <w:rFonts w:ascii="Arial" w:cs="Arial" w:eastAsia="Arial" w:hAnsi="Arial"/>
@@ -4814,7 +4814,7 @@
               <w:spacing w:after="10" w:before="0"/>
               <w:ind w:left="120"/>
             </w:pPr>
-            <w:hyperlink w:history="1" r:id="rIdoclljj1lkxswgdolxhzow">
+            <w:hyperlink w:history="1" r:id="rIdth_cyhescmlt3qvbjd3ez">
               <w:r>
                 <w:rPr>
                   <w:rFonts w:ascii="Arial" w:cs="Arial" w:eastAsia="Arial" w:hAnsi="Arial"/>
@@ -6593,7 +6593,7 @@
             <w:pPr>
               <w:spacing w:after="20" w:before="0"/>
             </w:pPr>
-            <w:hyperlink w:history="1" r:id="rId-1_lsfgx8kg7jukx17s7p">
+            <w:hyperlink w:history="1" r:id="rIdwm3wg3prrg-q89d-qid_1">
               <w:r>
                 <w:rPr>
                   <w:rFonts w:ascii="Arial" w:cs="Arial" w:eastAsia="Arial" w:hAnsi="Arial"/>
@@ -6626,7 +6626,7 @@
               <w:spacing w:after="10" w:before="0"/>
               <w:ind w:left="120"/>
             </w:pPr>
-            <w:hyperlink w:history="1" r:id="rIdfxxpsyu9umgdwgepdzebp">
+            <w:hyperlink w:history="1" r:id="rIdhsvio39q9pwjlxzxmit9o">
               <w:r>
                 <w:rPr>
                   <w:rFonts w:ascii="Arial" w:cs="Arial" w:eastAsia="Arial" w:hAnsi="Arial"/>
@@ -6671,7 +6671,7 @@
             <w:pPr>
               <w:spacing w:after="20" w:before="0"/>
             </w:pPr>
-            <w:hyperlink w:history="1" r:id="rIdemysro-ia-1tq77e3jhtu">
+            <w:hyperlink w:history="1" r:id="rIdczef1fj2h3cnx9rkdse3d">
               <w:r>
                 <w:rPr>
                   <w:rFonts w:ascii="Arial" w:cs="Arial" w:eastAsia="Arial" w:hAnsi="Arial"/>
@@ -6704,7 +6704,7 @@
               <w:spacing w:after="10" w:before="0"/>
               <w:ind w:left="120"/>
             </w:pPr>
-            <w:hyperlink w:history="1" r:id="rIdnnmqcvog_fd_exum5rtxy">
+            <w:hyperlink w:history="1" r:id="rId3phzmztpjpc9031cah2vb">
               <w:r>
                 <w:rPr>
                   <w:rFonts w:ascii="Arial" w:cs="Arial" w:eastAsia="Arial" w:hAnsi="Arial"/>
@@ -6912,7 +6912,7 @@
             <w:pPr>
               <w:spacing w:after="20" w:before="0"/>
             </w:pPr>
-            <w:hyperlink w:history="1" r:id="rIdavwjysr6iamqxq8tatxfd">
+            <w:hyperlink w:history="1" r:id="rIdprsjm2udre8e5sgqbackg">
               <w:r>
                 <w:rPr>
                   <w:rFonts w:ascii="Arial" w:cs="Arial" w:eastAsia="Arial" w:hAnsi="Arial"/>
@@ -6945,7 +6945,7 @@
               <w:spacing w:after="10" w:before="0"/>
               <w:ind w:left="120"/>
             </w:pPr>
-            <w:hyperlink w:history="1" r:id="rIdn2yqed7ob9gejnee-ulbt">
+            <w:hyperlink w:history="1" r:id="rIdbmerrdxayluwyxs2n9tmz">
               <w:r>
                 <w:rPr>
                   <w:rFonts w:ascii="Arial" w:cs="Arial" w:eastAsia="Arial" w:hAnsi="Arial"/>
@@ -6990,7 +6990,7 @@
             <w:pPr>
               <w:spacing w:after="20" w:before="0"/>
             </w:pPr>
-            <w:hyperlink w:history="1" r:id="rIdtrfxuz0gmanjd3qy1upaa">
+            <w:hyperlink w:history="1" r:id="rId_mcfn716rh8epddp-tvrg">
               <w:r>
                 <w:rPr>
                   <w:rFonts w:ascii="Arial" w:cs="Arial" w:eastAsia="Arial" w:hAnsi="Arial"/>
@@ -7023,7 +7023,7 @@
               <w:spacing w:after="10" w:before="0"/>
               <w:ind w:left="120"/>
             </w:pPr>
-            <w:hyperlink w:history="1" r:id="rIdsunisbsfabixakat5cc9b">
+            <w:hyperlink w:history="1" r:id="rIdia4-2pyahk_9fi_-zkj6r">
               <w:r>
                 <w:rPr>
                   <w:rFonts w:ascii="Arial" w:cs="Arial" w:eastAsia="Arial" w:hAnsi="Arial"/>
@@ -7231,7 +7231,7 @@
             <w:pPr>
               <w:spacing w:after="20" w:before="0"/>
             </w:pPr>
-            <w:hyperlink w:history="1" r:id="rId6gs8ji8srqrhxbxwucnir">
+            <w:hyperlink w:history="1" r:id="rIdfqporte8zduqnunj-wera">
               <w:r>
                 <w:rPr>
                   <w:rFonts w:ascii="Arial" w:cs="Arial" w:eastAsia="Arial" w:hAnsi="Arial"/>
@@ -7264,7 +7264,7 @@
               <w:spacing w:after="10" w:before="0"/>
               <w:ind w:left="120"/>
             </w:pPr>
-            <w:hyperlink w:history="1" r:id="rIdw_y6a42jzchjzlhmjjntd">
+            <w:hyperlink w:history="1" r:id="rId1cg4isejszqteib42g-_o">
               <w:r>
                 <w:rPr>
                   <w:rFonts w:ascii="Arial" w:cs="Arial" w:eastAsia="Arial" w:hAnsi="Arial"/>
@@ -7309,7 +7309,7 @@
             <w:pPr>
               <w:spacing w:after="20" w:before="0"/>
             </w:pPr>
-            <w:hyperlink w:history="1" r:id="rIdahfmljusabnmczwg-aly6">
+            <w:hyperlink w:history="1" r:id="rId5sg5bmodd6znjawlqcdpo">
               <w:r>
                 <w:rPr>
                   <w:rFonts w:ascii="Arial" w:cs="Arial" w:eastAsia="Arial" w:hAnsi="Arial"/>
@@ -7342,7 +7342,7 @@
               <w:spacing w:after="10" w:before="0"/>
               <w:ind w:left="120"/>
             </w:pPr>
-            <w:hyperlink w:history="1" r:id="rId_145sr-0qolhz3crlymbw">
+            <w:hyperlink w:history="1" r:id="rIdirzihckw-prbwn-y2ioe0">
               <w:r>
                 <w:rPr>
                   <w:rFonts w:ascii="Arial" w:cs="Arial" w:eastAsia="Arial" w:hAnsi="Arial"/>
@@ -7550,7 +7550,7 @@
             <w:pPr>
               <w:spacing w:after="20" w:before="0"/>
             </w:pPr>
-            <w:hyperlink w:history="1" r:id="rIdzhueh4g6gpernxljjf-6d">
+            <w:hyperlink w:history="1" r:id="rIduy7dfhtc2weyhld3yr4pm">
               <w:r>
                 <w:rPr>
                   <w:rFonts w:ascii="Arial" w:cs="Arial" w:eastAsia="Arial" w:hAnsi="Arial"/>
@@ -7583,7 +7583,7 @@
               <w:spacing w:after="10" w:before="0"/>
               <w:ind w:left="120"/>
             </w:pPr>
-            <w:hyperlink w:history="1" r:id="rIdlolcep1oxwwbee1miqr7-">
+            <w:hyperlink w:history="1" r:id="rIdzb44sr6gbbymv4gdl7cij">
               <w:r>
                 <w:rPr>
                   <w:rFonts w:ascii="Arial" w:cs="Arial" w:eastAsia="Arial" w:hAnsi="Arial"/>
@@ -7628,7 +7628,7 @@
             <w:pPr>
               <w:spacing w:after="20" w:before="0"/>
             </w:pPr>
-            <w:hyperlink w:history="1" r:id="rIdrvkvnmooyuv8rc9cgra-n">
+            <w:hyperlink w:history="1" r:id="rIds5drv-ispsbvproo8zabs">
               <w:r>
                 <w:rPr>
                   <w:rFonts w:ascii="Arial" w:cs="Arial" w:eastAsia="Arial" w:hAnsi="Arial"/>
@@ -7661,7 +7661,7 @@
               <w:spacing w:after="10" w:before="0"/>
               <w:ind w:left="120"/>
             </w:pPr>
-            <w:hyperlink w:history="1" r:id="rId5m3ddex2qsnvkt9wgvj_z">
+            <w:hyperlink w:history="1" r:id="rIdf067luhkqjlf70bij_zw3">
               <w:r>
                 <w:rPr>
                   <w:rFonts w:ascii="Arial" w:cs="Arial" w:eastAsia="Arial" w:hAnsi="Arial"/>
@@ -7869,7 +7869,7 @@
             <w:pPr>
               <w:spacing w:after="20" w:before="0"/>
             </w:pPr>
-            <w:hyperlink w:history="1" r:id="rIdonvrgvgsycjbraa7y4ccj">
+            <w:hyperlink w:history="1" r:id="rIdquc4pvaam3gc7q3mf3lwi">
               <w:r>
                 <w:rPr>
                   <w:rFonts w:ascii="Arial" w:cs="Arial" w:eastAsia="Arial" w:hAnsi="Arial"/>
@@ -7902,7 +7902,7 @@
               <w:spacing w:after="10" w:before="0"/>
               <w:ind w:left="120"/>
             </w:pPr>
-            <w:hyperlink w:history="1" r:id="rIdgk2gwd08zz2091msrdbfw">
+            <w:hyperlink w:history="1" r:id="rIdylw5cluyuhg-uvojk9gaq">
               <w:r>
                 <w:rPr>
                   <w:rFonts w:ascii="Arial" w:cs="Arial" w:eastAsia="Arial" w:hAnsi="Arial"/>
@@ -7947,7 +7947,7 @@
             <w:pPr>
               <w:spacing w:after="20" w:before="0"/>
             </w:pPr>
-            <w:hyperlink w:history="1" r:id="rId8rhvdlqrunheg6fzqhsg1">
+            <w:hyperlink w:history="1" r:id="rIdiquumjn4nci2wgdchm-c0">
               <w:r>
                 <w:rPr>
                   <w:rFonts w:ascii="Arial" w:cs="Arial" w:eastAsia="Arial" w:hAnsi="Arial"/>
@@ -7980,7 +7980,7 @@
               <w:spacing w:after="10" w:before="0"/>
               <w:ind w:left="120"/>
             </w:pPr>
-            <w:hyperlink w:history="1" r:id="rIdjeatjb1bim8sgmqk8wjex">
+            <w:hyperlink w:history="1" r:id="rIditouxg4etcle0xh11-rg1">
               <w:r>
                 <w:rPr>
                   <w:rFonts w:ascii="Arial" w:cs="Arial" w:eastAsia="Arial" w:hAnsi="Arial"/>
@@ -8583,7 +8583,7 @@
                 <w:sz w:val="22"/>
                 <w:szCs w:val="22"/>
               </w:rPr>
-              <w:t xml:space="preserve">LESSON 3 (40 minutes): Lesson 3</w:t>
+              <w:t xml:space="preserve">LESSON 3 (40 minutes): Field Collection Exercise: Deploying Traps, Conducting Searches, and Beginning Identification</w:t>
             </w:r>
           </w:p>
         </w:tc>
@@ -8736,21 +8736,21 @@
           </w:tcPr>
           <w:p>
             <w:pPr>
-              <w:spacing w:after="60" w:before="0"/>
-              <w:jc w:val="left"/>
-            </w:pPr>
-            <w:r>
-              <w:rPr>
-                <w:rFonts w:ascii="Arial" w:cs="Arial" w:eastAsia="Arial" w:hAnsi="Arial"/>
-                <w:b w:val="false"/>
-                <w:bCs w:val="false"/>
-                <w:i w:val="false"/>
-                <w:iCs w:val="false"/>
-                <w:color w:val="000000"/>
-                <w:sz w:val="18"/>
-                <w:szCs w:val="18"/>
-              </w:rPr>
-              <w:t xml:space="preserve"/>
+              <w:spacing w:after="40" w:before="0"/>
+              <w:jc w:val="left"/>
+            </w:pPr>
+            <w:r>
+              <w:rPr>
+                <w:rFonts w:ascii="Arial" w:cs="Arial" w:eastAsia="Arial" w:hAnsi="Arial"/>
+                <w:b w:val="false"/>
+                <w:bCs w:val="false"/>
+                <w:i w:val="false"/>
+                <w:iCs w:val="false"/>
+                <w:color w:val="000000"/>
+                <w:sz w:val="18"/>
+                <w:szCs w:val="18"/>
+              </w:rPr>
+              <w:t xml:space="preserve">Learners move from knowing about collection tools to actually using them in the school environment, gathering real organisms that will become the foundation of the sub-strand project and that make the contrast between the preserved butterfly and the decayed grasshopper personally meaningful.</w:t>
             </w:r>
           </w:p>
         </w:tc>
@@ -8802,21 +8802,21 @@
           </w:tcPr>
           <w:p>
             <w:pPr>
-              <w:spacing w:after="60" w:before="0"/>
-              <w:jc w:val="left"/>
-            </w:pPr>
-            <w:r>
-              <w:rPr>
-                <w:rFonts w:ascii="Arial" w:cs="Arial" w:eastAsia="Arial" w:hAnsi="Arial"/>
-                <w:b w:val="false"/>
-                <w:bCs w:val="false"/>
-                <w:i w:val="false"/>
-                <w:iCs w:val="false"/>
-                <w:color w:val="000000"/>
-                <w:sz w:val="18"/>
-                <w:szCs w:val="18"/>
-              </w:rPr>
-              <w:t xml:space="preserve"/>
+              <w:spacing w:after="40" w:before="0"/>
+              <w:jc w:val="left"/>
+            </w:pPr>
+            <w:r>
+              <w:rPr>
+                <w:rFonts w:ascii="Arial" w:cs="Arial" w:eastAsia="Arial" w:hAnsi="Arial"/>
+                <w:b w:val="false"/>
+                <w:bCs w:val="false"/>
+                <w:i w:val="false"/>
+                <w:iCs w:val="false"/>
+                <w:color w:val="000000"/>
+                <w:sz w:val="18"/>
+                <w:szCs w:val="18"/>
+              </w:rPr>
+              <w:t xml:space="preserve">Learners will be able to: (1) state the correct deployment procedure for a pitfall trap; (2) describe how a sweep net and hand search are used for different microhabitats; (3) use a simple dichotomous key to begin sorting collected invertebrates to major group level.</w:t>
             </w:r>
           </w:p>
         </w:tc>
@@ -8868,21 +8868,21 @@
           </w:tcPr>
           <w:p>
             <w:pPr>
-              <w:spacing w:after="60" w:before="0"/>
-              <w:jc w:val="left"/>
-            </w:pPr>
-            <w:r>
-              <w:rPr>
-                <w:rFonts w:ascii="Arial" w:cs="Arial" w:eastAsia="Arial" w:hAnsi="Arial"/>
-                <w:b w:val="false"/>
-                <w:bCs w:val="false"/>
-                <w:i w:val="false"/>
-                <w:iCs w:val="false"/>
-                <w:color w:val="000000"/>
-                <w:sz w:val="18"/>
-                <w:szCs w:val="18"/>
-              </w:rPr>
-              <w:t xml:space="preserve"/>
+              <w:spacing w:after="40" w:before="0"/>
+              <w:jc w:val="left"/>
+            </w:pPr>
+            <w:r>
+              <w:rPr>
+                <w:rFonts w:ascii="Arial" w:cs="Arial" w:eastAsia="Arial" w:hAnsi="Arial"/>
+                <w:b w:val="false"/>
+                <w:bCs w:val="false"/>
+                <w:i w:val="false"/>
+                <w:iCs w:val="false"/>
+                <w:color w:val="000000"/>
+                <w:sz w:val="18"/>
+                <w:szCs w:val="18"/>
+              </w:rPr>
+              <w:t xml:space="preserve">Learners practise scientific observation, field-notebook recording using tally charts, safe handling of live organisms, collaborative team roles, and preliminary taxonomic sorting using a dichotomous key.</w:t>
             </w:r>
           </w:p>
         </w:tc>
@@ -8934,21 +8934,21 @@
           </w:tcPr>
           <w:p>
             <w:pPr>
-              <w:spacing w:after="60" w:before="0"/>
-              <w:jc w:val="left"/>
-            </w:pPr>
-            <w:r>
-              <w:rPr>
-                <w:rFonts w:ascii="Arial" w:cs="Arial" w:eastAsia="Arial" w:hAnsi="Arial"/>
-                <w:b w:val="false"/>
-                <w:bCs w:val="false"/>
-                <w:i w:val="false"/>
-                <w:iCs w:val="false"/>
-                <w:color w:val="000000"/>
-                <w:sz w:val="18"/>
-                <w:szCs w:val="18"/>
-              </w:rPr>
-              <w:t xml:space="preserve"/>
+              <w:spacing w:after="40" w:before="0"/>
+              <w:jc w:val="left"/>
+            </w:pPr>
+            <w:r>
+              <w:rPr>
+                <w:rFonts w:ascii="Arial" w:cs="Arial" w:eastAsia="Arial" w:hAnsi="Arial"/>
+                <w:b w:val="false"/>
+                <w:bCs w:val="false"/>
+                <w:i w:val="false"/>
+                <w:iCs w:val="false"/>
+                <w:color w:val="000000"/>
+                <w:sz w:val="18"/>
+                <w:szCs w:val="18"/>
+              </w:rPr>
+              <w:t xml:space="preserve">Learners demonstrate respect for living organisms through careful handling, curiosity about local biodiversity, and responsibility by returning organisms not needed for the project to the environment unharmed.</w:t>
             </w:r>
           </w:p>
         </w:tc>
@@ -9000,21 +9000,21 @@
           </w:tcPr>
           <w:p>
             <w:pPr>
-              <w:spacing w:after="60" w:before="0"/>
-              <w:jc w:val="left"/>
-            </w:pPr>
-            <w:r>
-              <w:rPr>
-                <w:rFonts w:ascii="Arial" w:cs="Arial" w:eastAsia="Arial" w:hAnsi="Arial"/>
-                <w:b w:val="false"/>
-                <w:bCs w:val="false"/>
-                <w:i w:val="false"/>
-                <w:iCs w:val="false"/>
-                <w:color w:val="000000"/>
-                <w:sz w:val="18"/>
-                <w:szCs w:val="18"/>
-              </w:rPr>
-              <w:t xml:space="preserve"/>
+              <w:spacing w:after="40" w:before="0"/>
+              <w:jc w:val="left"/>
+            </w:pPr>
+            <w:r>
+              <w:rPr>
+                <w:rFonts w:ascii="Arial" w:cs="Arial" w:eastAsia="Arial" w:hAnsi="Arial"/>
+                <w:b w:val="false"/>
+                <w:bCs w:val="false"/>
+                <w:i w:val="false"/>
+                <w:iCs w:val="false"/>
+                <w:color w:val="000000"/>
+                <w:sz w:val="18"/>
+                <w:szCs w:val="18"/>
+              </w:rPr>
+              <w:t xml:space="preserve">How are specimens collected and preserved? — specifically the first step: how do biologists actually obtain organisms from the environment without damaging them?</w:t>
             </w:r>
           </w:p>
         </w:tc>
@@ -9066,21 +9066,21 @@
           </w:tcPr>
           <w:p>
             <w:pPr>
-              <w:spacing w:after="60" w:before="0"/>
-              <w:jc w:val="left"/>
-            </w:pPr>
-            <w:r>
-              <w:rPr>
-                <w:rFonts w:ascii="Arial" w:cs="Arial" w:eastAsia="Arial" w:hAnsi="Arial"/>
-                <w:b w:val="false"/>
-                <w:bCs w:val="false"/>
-                <w:i w:val="false"/>
-                <w:iCs w:val="false"/>
-                <w:color w:val="000000"/>
-                <w:sz w:val="18"/>
-                <w:szCs w:val="18"/>
-              </w:rPr>
-              <w:t xml:space="preserve"/>
+              <w:spacing w:after="40" w:before="0"/>
+              <w:jc w:val="left"/>
+            </w:pPr>
+            <w:r>
+              <w:rPr>
+                <w:rFonts w:ascii="Arial" w:cs="Arial" w:eastAsia="Arial" w:hAnsi="Arial"/>
+                <w:b w:val="false"/>
+                <w:bCs w:val="false"/>
+                <w:i w:val="false"/>
+                <w:iCs w:val="false"/>
+                <w:color w:val="000000"/>
+                <w:sz w:val="18"/>
+                <w:szCs w:val="18"/>
+              </w:rPr>
+              <w:t xml:space="preserve">This lesson supplies the raw, first-hand observational data that will be processed in Lessons 4 and 5. Learners transition from examining instruments to generating real specimens and biodiversity records from their own school compound, making the driving question concrete and personal.</w:t>
             </w:r>
           </w:p>
         </w:tc>
@@ -9130,25 +9130,7 @@
             </w:tcMar>
             <w:vAlign w:val="top"/>
           </w:tcPr>
-          <w:p>
-            <w:pPr>
-              <w:spacing w:after="60" w:before="0"/>
-              <w:jc w:val="left"/>
-            </w:pPr>
-            <w:r>
-              <w:rPr>
-                <w:rFonts w:ascii="Arial" w:cs="Arial" w:eastAsia="Arial" w:hAnsi="Arial"/>
-                <w:b w:val="false"/>
-                <w:bCs w:val="false"/>
-                <w:i w:val="false"/>
-                <w:iCs w:val="false"/>
-                <w:color w:val="000000"/>
-                <w:sz w:val="18"/>
-                <w:szCs w:val="18"/>
-              </w:rPr>
-              <w:t xml:space="preserve"/>
-            </w:r>
-          </w:p>
+          <w:p/>
         </w:tc>
       </w:tr>
     </w:tbl>
@@ -9225,21 +9207,21 @@
           </w:tcPr>
           <w:p>
             <w:pPr>
-              <w:spacing w:after="60" w:before="0"/>
-              <w:jc w:val="left"/>
-            </w:pPr>
-            <w:r>
-              <w:rPr>
-                <w:rFonts w:ascii="Arial" w:cs="Arial" w:eastAsia="Arial" w:hAnsi="Arial"/>
-                <w:b w:val="false"/>
-                <w:bCs w:val="false"/>
-                <w:i w:val="false"/>
-                <w:iCs w:val="false"/>
-                <w:color w:val="000000"/>
-                <w:sz w:val="18"/>
-                <w:szCs w:val="18"/>
-              </w:rPr>
-              <w:t xml:space="preserve"/>
+              <w:spacing w:after="40" w:before="0"/>
+              <w:jc w:val="left"/>
+            </w:pPr>
+            <w:r>
+              <w:rPr>
+                <w:rFonts w:ascii="Arial" w:cs="Arial" w:eastAsia="Arial" w:hAnsi="Arial"/>
+                <w:b w:val="false"/>
+                <w:bCs w:val="false"/>
+                <w:i w:val="false"/>
+                <w:iCs w:val="false"/>
+                <w:color w:val="000000"/>
+                <w:sz w:val="18"/>
+                <w:szCs w:val="18"/>
+              </w:rPr>
+              <w:t xml:space="preserve">In the first 5 minutes learners connect their knowledge of collection tools from Lesson 2 to a prediction about which organisms they expect to find in specific school microhabitats. Teams then spend approximately 20 minutes outdoors: half the teams dig and deploy pitfall traps and conduct hand searches in leaf litter and soil, while the other half conduct sweep-net searches through grass and low bushes. All teams record findings live in field notebooks using tally charts. In the final 15 minutes learners return to class, pool their tally data on the board, and begin sorting organisms using a printed simple dichotomous key, connecting each find back to the question of which organisms are easy or difficult to preserve and why.</w:t>
             </w:r>
           </w:p>
         </w:tc>
@@ -9550,21 +9532,21 @@
           </w:tcPr>
           <w:p>
             <w:pPr>
-              <w:spacing w:after="60" w:before="0"/>
-              <w:jc w:val="left"/>
-            </w:pPr>
-            <w:r>
-              <w:rPr>
-                <w:rFonts w:ascii="Arial" w:cs="Arial" w:eastAsia="Arial" w:hAnsi="Arial"/>
-                <w:b w:val="false"/>
-                <w:bCs w:val="false"/>
-                <w:i w:val="false"/>
-                <w:iCs w:val="false"/>
-                <w:color w:val="000000"/>
-                <w:sz w:val="18"/>
-                <w:szCs w:val="18"/>
-              </w:rPr>
-              <w:t xml:space="preserve"/>
+              <w:spacing w:after="40" w:before="0"/>
+              <w:jc w:val="left"/>
+            </w:pPr>
+            <w:r>
+              <w:rPr>
+                <w:rFonts w:ascii="Arial" w:cs="Arial" w:eastAsia="Arial" w:hAnsi="Arial"/>
+                <w:b w:val="false"/>
+                <w:bCs w:val="false"/>
+                <w:i w:val="false"/>
+                <w:iCs w:val="false"/>
+                <w:color w:val="000000"/>
+                <w:sz w:val="18"/>
+                <w:szCs w:val="18"/>
+              </w:rPr>
+              <w:t xml:space="preserve">Before going outside, each team of four receives a hand-drawn school compound map showing four microhabitats: bare soil near the science block, the grass field, the shrub/hedge line, and leaf litter under a tree. Each learner individually writes in their field notebook: (a) which two organisms they predict their team will find, and (b) which collection method they predict will work best in their assigned microhabitat. Teams then share predictions aloud for 2 minutes and agree on a single team prediction to record at the top of their tally chart. This activates prior knowledge of tool-organism matching from Lesson 2 and creates a testable claim learners will revisit when they return.</w:t>
             </w:r>
           </w:p>
         </w:tc>
@@ -9600,7 +9582,7 @@
             <w:pPr>
               <w:spacing w:after="20" w:before="0"/>
             </w:pPr>
-            <w:hyperlink w:history="1" r:id="rIdfciw8rrl2vig0u5cb6vo6">
+            <w:hyperlink w:history="1" r:id="rId-ogdpquri3kg937dam8ew">
               <w:r>
                 <w:rPr>
                   <w:rFonts w:ascii="Arial" w:cs="Arial" w:eastAsia="Arial" w:hAnsi="Arial"/>
@@ -9609,7 +9591,7 @@
                   <w:szCs w:val="16"/>
                   <w:u w:val="single" w:color="2E75B6"/>
                 </w:rPr>
-                <w:t xml:space="preserve">Genetics vocabulary</w:t>
+                <w:t xml:space="preserve">Strategy in solving quadratic equations</w:t>
               </w:r>
             </w:hyperlink>
           </w:p>
@@ -9633,7 +9615,7 @@
               <w:spacing w:after="10" w:before="0"/>
               <w:ind w:left="120"/>
             </w:pPr>
-            <w:hyperlink w:history="1" r:id="rId4itm6tbu_yziwbhku7wbp">
+            <w:hyperlink w:history="1" r:id="rIdydbfbuvjtp7lvxw09npl5">
               <w:r>
                 <w:rPr>
                   <w:rFonts w:ascii="Arial" w:cs="Arial" w:eastAsia="Arial" w:hAnsi="Arial"/>
@@ -9671,14 +9653,14 @@
                 <w:sz w:val="16"/>
                 <w:szCs w:val="16"/>
               </w:rPr>
-              <w:t xml:space="preserve">📖 HTML:</w:t>
+              <w:t xml:space="preserve">📖 PDF:</w:t>
             </w:r>
           </w:p>
           <w:p>
             <w:pPr>
               <w:spacing w:after="20" w:before="0"/>
             </w:pPr>
-            <w:hyperlink w:history="1" r:id="rIdtadik1bn2f3jxms8eb8yd">
+            <w:hyperlink w:history="1" r:id="rIdj6yscimu8ilpwlvjcydca">
               <w:r>
                 <w:rPr>
                   <w:rFonts w:ascii="Arial" w:cs="Arial" w:eastAsia="Arial" w:hAnsi="Arial"/>
@@ -9687,7 +9669,7 @@
                   <w:szCs w:val="16"/>
                   <w:u w:val="single" w:color="2E75B6"/>
                 </w:rPr>
-                <w:t xml:space="preserve">Build the complementary DNA strand! (PLIX)</w:t>
+                <w:t xml:space="preserve">The Ecological Cost ..:Activity 2, Teacher Notes &amp; Answer Key: What Do Plants and Animals Do With Energy?</w:t>
               </w:r>
             </w:hyperlink>
           </w:p>
@@ -9703,7 +9685,7 @@
                 <w:sz w:val="14"/>
                 <w:szCs w:val="14"/>
               </w:rPr>
-              <w:t xml:space="preserve">Source: CK-12</w:t>
+              <w:t xml:space="preserve">Source: MIT Blossoms</w:t>
             </w:r>
           </w:p>
           <w:p>
@@ -9711,7 +9693,7 @@
               <w:spacing w:after="10" w:before="0"/>
               <w:ind w:left="120"/>
             </w:pPr>
-            <w:hyperlink w:history="1" r:id="rIdp-l4u_ql5yopqk5coj0zu">
+            <w:hyperlink w:history="1" r:id="rIdne7_ploboktwmy8ixdkca">
               <w:r>
                 <w:rPr>
                   <w:rFonts w:ascii="Arial" w:cs="Arial" w:eastAsia="Arial" w:hAnsi="Arial"/>
@@ -9739,21 +9721,21 @@
           </w:tcPr>
           <w:p>
             <w:pPr>
-              <w:spacing w:after="60" w:before="0"/>
-              <w:jc w:val="left"/>
-            </w:pPr>
-            <w:r>
-              <w:rPr>
-                <w:rFonts w:ascii="Arial" w:cs="Arial" w:eastAsia="Arial" w:hAnsi="Arial"/>
-                <w:b w:val="false"/>
-                <w:bCs w:val="false"/>
-                <w:i w:val="false"/>
-                <w:iCs w:val="false"/>
-                <w:color w:val="000000"/>
-                <w:sz w:val="18"/>
-                <w:szCs w:val="18"/>
-              </w:rPr>
-              <w:t xml:space="preserve"/>
+              <w:spacing w:after="40" w:before="0"/>
+              <w:jc w:val="left"/>
+            </w:pPr>
+            <w:r>
+              <w:rPr>
+                <w:rFonts w:ascii="Arial" w:cs="Arial" w:eastAsia="Arial" w:hAnsi="Arial"/>
+                <w:b w:val="false"/>
+                <w:bCs w:val="false"/>
+                <w:i w:val="false"/>
+                <w:iCs w:val="false"/>
+                <w:color w:val="000000"/>
+                <w:sz w:val="18"/>
+                <w:szCs w:val="18"/>
+              </w:rPr>
+              <w:t xml:space="preserve">Distribute maps before leaving the classroom. Ask: 'Look at the leaf litter zone on your map. Which tool did we say in Lesson 2 is best for organisms that hide under debris — and why does that tool reduce damage to the specimen?' Allow 30 SECONDS WAIT TIME. Cold-call one team. Then ask: 'Before we go out, what would it mean for our project if we collect an organism and it is already crushed or missing a leg — can we still use it as a specimen?' Allow 20 SECONDS WAIT TIME. Accept one or two brief responses. This links the prediction directly to the butterfly-versus-grasshopper phenomenon: condition at collection determines whether preservation is even possible.</w:t>
             </w:r>
           </w:p>
         </w:tc>
@@ -9771,21 +9753,21 @@
           </w:tcPr>
           <w:p>
             <w:pPr>
-              <w:spacing w:after="60" w:before="0"/>
-              <w:jc w:val="left"/>
-            </w:pPr>
-            <w:r>
-              <w:rPr>
-                <w:rFonts w:ascii="Arial" w:cs="Arial" w:eastAsia="Arial" w:hAnsi="Arial"/>
-                <w:b w:val="false"/>
-                <w:bCs w:val="false"/>
-                <w:i w:val="false"/>
-                <w:iCs w:val="false"/>
-                <w:color w:val="000000"/>
-                <w:sz w:val="18"/>
-                <w:szCs w:val="18"/>
-              </w:rPr>
-              <w:t xml:space="preserve"/>
+              <w:spacing w:after="40" w:before="0"/>
+              <w:jc w:val="left"/>
+            </w:pPr>
+            <w:r>
+              <w:rPr>
+                <w:rFonts w:ascii="Arial" w:cs="Arial" w:eastAsia="Arial" w:hAnsi="Arial"/>
+                <w:b w:val="false"/>
+                <w:bCs w:val="false"/>
+                <w:i w:val="false"/>
+                <w:iCs w:val="false"/>
+                <w:color w:val="000000"/>
+                <w:sz w:val="18"/>
+                <w:szCs w:val="18"/>
+              </w:rPr>
+              <w:t xml:space="preserve">Prediction with justification written in field notebooks creates accountability. The team consensus prediction functions as a hypothesis that the observation phase will test, modelling scientific practice.</w:t>
             </w:r>
           </w:p>
         </w:tc>
@@ -9803,21 +9785,21 @@
           </w:tcPr>
           <w:p>
             <w:pPr>
-              <w:spacing w:after="60" w:before="0"/>
-              <w:jc w:val="left"/>
-            </w:pPr>
-            <w:r>
-              <w:rPr>
-                <w:rFonts w:ascii="Arial" w:cs="Arial" w:eastAsia="Arial" w:hAnsi="Arial"/>
-                <w:b w:val="false"/>
-                <w:bCs w:val="false"/>
-                <w:i w:val="false"/>
-                <w:iCs w:val="false"/>
-                <w:color w:val="000000"/>
-                <w:sz w:val="18"/>
-                <w:szCs w:val="18"/>
-              </w:rPr>
-              <w:t xml:space="preserve"/>
+              <w:spacing w:after="40" w:before="0"/>
+              <w:jc w:val="left"/>
+            </w:pPr>
+            <w:r>
+              <w:rPr>
+                <w:rFonts w:ascii="Arial" w:cs="Arial" w:eastAsia="Arial" w:hAnsi="Arial"/>
+                <w:b w:val="false"/>
+                <w:bCs w:val="false"/>
+                <w:i w:val="false"/>
+                <w:iCs w:val="false"/>
+                <w:color w:val="000000"/>
+                <w:sz w:val="18"/>
+                <w:szCs w:val="18"/>
+              </w:rPr>
+              <w:t xml:space="preserve">Teacher circulates and reads over shoulders: are predictions grounded in tool-organism logic from Lesson 2, or are they random guesses? Prompt any team that predicts 'we will find butterflies' with a sweep net without justification by asking: 'What feature of the sweep net makes it suitable for a butterfly — and remember what happened to the grasshopper left in the bag.'</w:t>
             </w:r>
           </w:p>
         </w:tc>
@@ -9869,21 +9851,21 @@
           </w:tcPr>
           <w:p>
             <w:pPr>
-              <w:spacing w:after="60" w:before="0"/>
-              <w:jc w:val="left"/>
-            </w:pPr>
-            <w:r>
-              <w:rPr>
-                <w:rFonts w:ascii="Arial" w:cs="Arial" w:eastAsia="Arial" w:hAnsi="Arial"/>
-                <w:b w:val="false"/>
-                <w:bCs w:val="false"/>
-                <w:i w:val="false"/>
-                <w:iCs w:val="false"/>
-                <w:color w:val="000000"/>
-                <w:sz w:val="18"/>
-                <w:szCs w:val="18"/>
-              </w:rPr>
-              <w:t xml:space="preserve"/>
+              <w:spacing w:after="40" w:before="0"/>
+              <w:jc w:val="left"/>
+            </w:pPr>
+            <w:r>
+              <w:rPr>
+                <w:rFonts w:ascii="Arial" w:cs="Arial" w:eastAsia="Arial" w:hAnsi="Arial"/>
+                <w:b w:val="false"/>
+                <w:bCs w:val="false"/>
+                <w:i w:val="false"/>
+                <w:iCs w:val="false"/>
+                <w:color w:val="000000"/>
+                <w:sz w:val="18"/>
+                <w:szCs w:val="18"/>
+              </w:rPr>
+              <w:t xml:space="preserve">Teams move to the school compound in a single supervised file. Team roles are assigned: Trap Operator (digs or positions the trap), Searcher (sweeps net or moves leaf litter with forceps), Recorder (writes tally in field notebook), and Handler (uses forceps or cup to transfer organisms to the collection jar without crushing). At the pitfall-trap stations, Trap Operators dig a small hole using a trowel, set a plastic cup flush with the soil surface, and add a small piece of moist leaf as humidity material. Sweep-net teams make 10 sweeps through the grass, then invert the net carefully into a white tray to observe contents. Hand-search teams use forceps to lift leaf litter and examine the undersides of stones or bark. Recorders use a tally chart with columns: microhabitat, organism description (e.g., 'small brown beetle, 6 legs'), count, and a quick sketch. All living organisms not selected as project specimens are released gently after recording. After 20 minutes the teacher signals return to class.</w:t>
             </w:r>
           </w:p>
         </w:tc>
@@ -9919,7 +9901,7 @@
             <w:pPr>
               <w:spacing w:after="20" w:before="0"/>
             </w:pPr>
-            <w:hyperlink w:history="1" r:id="rId7ljbgpzivlbngmkpqu4f5">
+            <w:hyperlink w:history="1" r:id="rIdkrc098ymcaw5rlfhtjtqu">
               <w:r>
                 <w:rPr>
                   <w:rFonts w:ascii="Arial" w:cs="Arial" w:eastAsia="Arial" w:hAnsi="Arial"/>
@@ -9928,7 +9910,7 @@
                   <w:szCs w:val="16"/>
                   <w:u w:val="single" w:color="2E75B6"/>
                 </w:rPr>
-                <w:t xml:space="preserve">Genetics vocabulary</w:t>
+                <w:t xml:space="preserve">Strategy in solving quadratic equations</w:t>
               </w:r>
             </w:hyperlink>
           </w:p>
@@ -9952,7 +9934,7 @@
               <w:spacing w:after="10" w:before="0"/>
               <w:ind w:left="120"/>
             </w:pPr>
-            <w:hyperlink w:history="1" r:id="rId5kiqh-rl66cg4lbhkpchy">
+            <w:hyperlink w:history="1" r:id="rId_odke6wqtzmk-mmzx0fcu">
               <w:r>
                 <w:rPr>
                   <w:rFonts w:ascii="Arial" w:cs="Arial" w:eastAsia="Arial" w:hAnsi="Arial"/>
@@ -9990,14 +9972,14 @@
                 <w:sz w:val="16"/>
                 <w:szCs w:val="16"/>
               </w:rPr>
-              <w:t xml:space="preserve">📖 HTML:</w:t>
+              <w:t xml:space="preserve">📖 PDF:</w:t>
             </w:r>
           </w:p>
           <w:p>
             <w:pPr>
               <w:spacing w:after="20" w:before="0"/>
             </w:pPr>
-            <w:hyperlink w:history="1" r:id="rId80ntid-qir1g3ikr8udyf">
+            <w:hyperlink w:history="1" r:id="rIdd8xv6ojc6u127-83cnpgn">
               <w:r>
                 <w:rPr>
                   <w:rFonts w:ascii="Arial" w:cs="Arial" w:eastAsia="Arial" w:hAnsi="Arial"/>
@@ -10006,7 +9988,7 @@
                   <w:szCs w:val="16"/>
                   <w:u w:val="single" w:color="2E75B6"/>
                 </w:rPr>
-                <w:t xml:space="preserve">Build the complementary DNA strand! (PLIX)</w:t>
+                <w:t xml:space="preserve">The Ecological Cost ..:Activity 2, Teacher Notes &amp; Answer Key: What Do Plants and Animals Do With Energy?</w:t>
               </w:r>
             </w:hyperlink>
           </w:p>
@@ -10022,7 +10004,7 @@
                 <w:sz w:val="14"/>
                 <w:szCs w:val="14"/>
               </w:rPr>
-              <w:t xml:space="preserve">Source: CK-12</w:t>
+              <w:t xml:space="preserve">Source: MIT Blossoms</w:t>
             </w:r>
           </w:p>
           <w:p>
@@ -10030,7 +10012,7 @@
               <w:spacing w:after="10" w:before="0"/>
               <w:ind w:left="120"/>
             </w:pPr>
-            <w:hyperlink w:history="1" r:id="rIdiactweypx5k5umlho4dis">
+            <w:hyperlink w:history="1" r:id="rId01pzqfft_eby1emyyc5wi">
               <w:r>
                 <w:rPr>
                   <w:rFonts w:ascii="Arial" w:cs="Arial" w:eastAsia="Arial" w:hAnsi="Arial"/>
@@ -10058,21 +10040,21 @@
           </w:tcPr>
           <w:p>
             <w:pPr>
-              <w:spacing w:after="60" w:before="0"/>
-              <w:jc w:val="left"/>
-            </w:pPr>
-            <w:r>
-              <w:rPr>
-                <w:rFonts w:ascii="Arial" w:cs="Arial" w:eastAsia="Arial" w:hAnsi="Arial"/>
-                <w:b w:val="false"/>
-                <w:bCs w:val="false"/>
-                <w:i w:val="false"/>
-                <w:iCs w:val="false"/>
-                <w:color w:val="000000"/>
-                <w:sz w:val="18"/>
-                <w:szCs w:val="18"/>
-              </w:rPr>
-              <w:t xml:space="preserve"/>
+              <w:spacing w:after="40" w:before="0"/>
+              <w:jc w:val="left"/>
+            </w:pPr>
+            <w:r>
+              <w:rPr>
+                <w:rFonts w:ascii="Arial" w:cs="Arial" w:eastAsia="Arial" w:hAnsi="Arial"/>
+                <w:b w:val="false"/>
+                <w:bCs w:val="false"/>
+                <w:i w:val="false"/>
+                <w:iCs w:val="false"/>
+                <w:color w:val="000000"/>
+                <w:sz w:val="18"/>
+                <w:szCs w:val="18"/>
+              </w:rPr>
+              <w:t xml:space="preserve">While circulating outdoors, crouch beside each team and narrate what you see: 'Your net has three insects in it — before you transfer them, look at the wings. Are they intact? Remember the butterfly that survived ten years — why are those wings still perfect?' Allow 20 SECONDS WAIT TIME before the team responds. For pitfall-trap teams, ask: 'Why are we making the cup flush with the ground rather than sticking it up above the surface?' Expected answer: organisms walk in naturally rather than being startled. If a team finds an ant column, say: 'Interesting — how would you record a colony in a tally? Do you record every individual or note the colony?' Do not give the answer; allow the Recorder to make a decision and justify it. At the 18-minute mark, give a 2-minute warning. On return to class, immediately direct all learners to wash hands.</w:t>
             </w:r>
           </w:p>
         </w:tc>
@@ -10090,21 +10072,21 @@
           </w:tcPr>
           <w:p>
             <w:pPr>
-              <w:spacing w:after="60" w:before="0"/>
-              <w:jc w:val="left"/>
-            </w:pPr>
-            <w:r>
-              <w:rPr>
-                <w:rFonts w:ascii="Arial" w:cs="Arial" w:eastAsia="Arial" w:hAnsi="Arial"/>
-                <w:b w:val="false"/>
-                <w:bCs w:val="false"/>
-                <w:i w:val="false"/>
-                <w:iCs w:val="false"/>
-                <w:color w:val="000000"/>
-                <w:sz w:val="18"/>
-                <w:szCs w:val="18"/>
-              </w:rPr>
-              <w:t xml:space="preserve"/>
+              <w:spacing w:after="40" w:before="0"/>
+              <w:jc w:val="left"/>
+            </w:pPr>
+            <w:r>
+              <w:rPr>
+                <w:rFonts w:ascii="Arial" w:cs="Arial" w:eastAsia="Arial" w:hAnsi="Arial"/>
+                <w:b w:val="false"/>
+                <w:bCs w:val="false"/>
+                <w:i w:val="false"/>
+                <w:iCs w:val="false"/>
+                <w:color w:val="000000"/>
+                <w:sz w:val="18"/>
+                <w:szCs w:val="18"/>
+              </w:rPr>
+              <w:t xml:space="preserve">Live field-notebook tally charts provide a concrete, structured record. The four team roles prevent passenger behaviour and distribute cognitive load. Using a white tray to inspect net contents is a professional entomological technique that makes organisms visible without damage — the teacher names this explicitly as the same care that kept the Kakamega butterfly perfect.</w:t>
             </w:r>
           </w:p>
         </w:tc>
@@ -10122,21 +10104,21 @@
           </w:tcPr>
           <w:p>
             <w:pPr>
-              <w:spacing w:after="60" w:before="0"/>
-              <w:jc w:val="left"/>
-            </w:pPr>
-            <w:r>
-              <w:rPr>
-                <w:rFonts w:ascii="Arial" w:cs="Arial" w:eastAsia="Arial" w:hAnsi="Arial"/>
-                <w:b w:val="false"/>
-                <w:bCs w:val="false"/>
-                <w:i w:val="false"/>
-                <w:iCs w:val="false"/>
-                <w:color w:val="000000"/>
-                <w:sz w:val="18"/>
-                <w:szCs w:val="18"/>
-              </w:rPr>
-              <w:t xml:space="preserve"/>
+              <w:spacing w:after="40" w:before="0"/>
+              <w:jc w:val="left"/>
+            </w:pPr>
+            <w:r>
+              <w:rPr>
+                <w:rFonts w:ascii="Arial" w:cs="Arial" w:eastAsia="Arial" w:hAnsi="Arial"/>
+                <w:b w:val="false"/>
+                <w:bCs w:val="false"/>
+                <w:i w:val="false"/>
+                <w:iCs w:val="false"/>
+                <w:color w:val="000000"/>
+                <w:sz w:val="18"/>
+                <w:szCs w:val="18"/>
+              </w:rPr>
+              <w:t xml:space="preserve">Teacher checks that every Recorder is writing descriptions specific enough to sort later (body shape, leg count, wings present or absent) rather than vague labels. Ask any team that writes only 'bug' to add one observable feature. Teacher also checks that no learner is squeezing or pinching organisms with bare fingers.</w:t>
             </w:r>
           </w:p>
         </w:tc>
@@ -10188,21 +10170,21 @@
           </w:tcPr>
           <w:p>
             <w:pPr>
-              <w:spacing w:after="60" w:before="0"/>
-              <w:jc w:val="left"/>
-            </w:pPr>
-            <w:r>
-              <w:rPr>
-                <w:rFonts w:ascii="Arial" w:cs="Arial" w:eastAsia="Arial" w:hAnsi="Arial"/>
-                <w:b w:val="false"/>
-                <w:bCs w:val="false"/>
-                <w:i w:val="false"/>
-                <w:iCs w:val="false"/>
-                <w:color w:val="000000"/>
-                <w:sz w:val="18"/>
-                <w:szCs w:val="18"/>
-              </w:rPr>
-              <w:t xml:space="preserve"/>
+              <w:spacing w:after="40" w:before="0"/>
+              <w:jc w:val="left"/>
+            </w:pPr>
+            <w:r>
+              <w:rPr>
+                <w:rFonts w:ascii="Arial" w:cs="Arial" w:eastAsia="Arial" w:hAnsi="Arial"/>
+                <w:b w:val="false"/>
+                <w:bCs w:val="false"/>
+                <w:i w:val="false"/>
+                <w:iCs w:val="false"/>
+                <w:color w:val="000000"/>
+                <w:sz w:val="18"/>
+                <w:szCs w:val="18"/>
+              </w:rPr>
+              <w:t xml:space="preserve">Back in the classroom, each team reads out their tally totals. The teacher creates a class master tally on the board, grouping organisms by microhabitat and broad category (insects, worms, spiders, centipedes, other). Learners count total species types recorded across all teams. Teams then receive a printed single-page dichotomous key for common East African school-compound invertebrates (adapted from Kenya Institute of Curriculum Development-aligned resources) covering ants, beetles, grasshoppers, spiders, millipedes, earthworms, and moth larvae. Each team works through the key for at least two organisms from their tally, recording the key pathway step by step in their notebooks. The teacher then facilitates a whole-class discussion linking collection findings back to the driving question: 'We collected these organisms alive and mostly undamaged. What has to happen next before they can be preserved — and why does doing nothing, like leaving the grasshopper in a plastic bag, produce a completely different outcome?'</w:t>
             </w:r>
           </w:p>
         </w:tc>
@@ -10238,7 +10220,7 @@
             <w:pPr>
               <w:spacing w:after="20" w:before="0"/>
             </w:pPr>
-            <w:hyperlink w:history="1" r:id="rIdbhubkaeif6fyefp-ua-r5">
+            <w:hyperlink w:history="1" r:id="rId-wz1ftdwnsy71zrhsyjhk">
               <w:r>
                 <w:rPr>
                   <w:rFonts w:ascii="Arial" w:cs="Arial" w:eastAsia="Arial" w:hAnsi="Arial"/>
@@ -10247,7 +10229,7 @@
                   <w:szCs w:val="16"/>
                   <w:u w:val="single" w:color="2E75B6"/>
                 </w:rPr>
-                <w:t xml:space="preserve">Genetics vocabulary</w:t>
+                <w:t xml:space="preserve">Strategy in solving quadratic equations</w:t>
               </w:r>
             </w:hyperlink>
           </w:p>
@@ -10271,7 +10253,7 @@
               <w:spacing w:after="10" w:before="0"/>
               <w:ind w:left="120"/>
             </w:pPr>
-            <w:hyperlink w:history="1" r:id="rIdrpblh3pegxuulavoisjha">
+            <w:hyperlink w:history="1" r:id="rIddoxqscwjkcmwkottbid2q">
               <w:r>
                 <w:rPr>
                   <w:rFonts w:ascii="Arial" w:cs="Arial" w:eastAsia="Arial" w:hAnsi="Arial"/>
@@ -10309,14 +10291,14 @@
                 <w:sz w:val="16"/>
                 <w:szCs w:val="16"/>
               </w:rPr>
-              <w:t xml:space="preserve">📖 HTML:</w:t>
+              <w:t xml:space="preserve">📖 PDF:</w:t>
             </w:r>
           </w:p>
           <w:p>
             <w:pPr>
               <w:spacing w:after="20" w:before="0"/>
             </w:pPr>
-            <w:hyperlink w:history="1" r:id="rIddv1ownauwnxo1me431kxt">
+            <w:hyperlink w:history="1" r:id="rIdkrqovqibdp3dxxdoxszyf">
               <w:r>
                 <w:rPr>
                   <w:rFonts w:ascii="Arial" w:cs="Arial" w:eastAsia="Arial" w:hAnsi="Arial"/>
@@ -10325,7 +10307,7 @@
                   <w:szCs w:val="16"/>
                   <w:u w:val="single" w:color="2E75B6"/>
                 </w:rPr>
-                <w:t xml:space="preserve">Build the complementary DNA strand! (PLIX)</w:t>
+                <w:t xml:space="preserve">The Ecological Cost ..:Activity 2, Teacher Notes &amp; Answer Key: What Do Plants and Animals Do With Energy?</w:t>
               </w:r>
             </w:hyperlink>
           </w:p>
@@ -10341,7 +10323,7 @@
                 <w:sz w:val="14"/>
                 <w:szCs w:val="14"/>
               </w:rPr>
-              <w:t xml:space="preserve">Source: CK-12</w:t>
+              <w:t xml:space="preserve">Source: MIT Blossoms</w:t>
             </w:r>
           </w:p>
           <w:p>
@@ -10349,7 +10331,7 @@
               <w:spacing w:after="10" w:before="0"/>
               <w:ind w:left="120"/>
             </w:pPr>
-            <w:hyperlink w:history="1" r:id="rId9ljjgvpeqxxmp7j8dty48">
+            <w:hyperlink w:history="1" r:id="rIdtpxuk10h1rlrwj7fx5ofs">
               <w:r>
                 <w:rPr>
                   <w:rFonts w:ascii="Arial" w:cs="Arial" w:eastAsia="Arial" w:hAnsi="Arial"/>
@@ -10377,21 +10359,21 @@
           </w:tcPr>
           <w:p>
             <w:pPr>
-              <w:spacing w:after="60" w:before="0"/>
-              <w:jc w:val="left"/>
-            </w:pPr>
-            <w:r>
-              <w:rPr>
-                <w:rFonts w:ascii="Arial" w:cs="Arial" w:eastAsia="Arial" w:hAnsi="Arial"/>
-                <w:b w:val="false"/>
-                <w:bCs w:val="false"/>
-                <w:i w:val="false"/>
-                <w:iCs w:val="false"/>
-                <w:color w:val="000000"/>
-                <w:sz w:val="18"/>
-                <w:szCs w:val="18"/>
-              </w:rPr>
-              <w:t xml:space="preserve"/>
+              <w:spacing w:after="40" w:before="0"/>
+              <w:jc w:val="left"/>
+            </w:pPr>
+            <w:r>
+              <w:rPr>
+                <w:rFonts w:ascii="Arial" w:cs="Arial" w:eastAsia="Arial" w:hAnsi="Arial"/>
+                <w:b w:val="false"/>
+                <w:bCs w:val="false"/>
+                <w:i w:val="false"/>
+                <w:iCs w:val="false"/>
+                <w:color w:val="000000"/>
+                <w:sz w:val="18"/>
+                <w:szCs w:val="18"/>
+              </w:rPr>
+              <w:t xml:space="preserve">During key practice, circulate and ask: 'What feature at step 1 of the key did you look at — and could you observe that feature on a crushed or blackened specimen?' This ties key use directly to the phenomenon. Allow 30 SECONDS WAIT TIME. After teams report their identifications, ask the class: 'We found earthworms and we found beetles in the same microhabitat. If we wanted to preserve one of each, would we use the same method? What do you think — and what information would you need to decide?' Allow 30 SECONDS WAIT TIME. Record learner ideas on the board under the heading 'Questions for Lesson 4.' This advances the driving question by revealing that different organisms likely require different preservation approaches — a concept that will be unpacked in Lessons 4 and 5. If time permits, highlight that Kakamega Forest — home of the butterfly in the phenomenon — is one of Kenya's biodiversity hotspots and that the National Museums of Kenya holds thousands of specimens collected there, each one processed the way learners are beginning to learn.</w:t>
             </w:r>
           </w:p>
         </w:tc>
@@ -10409,21 +10391,21 @@
           </w:tcPr>
           <w:p>
             <w:pPr>
-              <w:spacing w:after="60" w:before="0"/>
-              <w:jc w:val="left"/>
-            </w:pPr>
-            <w:r>
-              <w:rPr>
-                <w:rFonts w:ascii="Arial" w:cs="Arial" w:eastAsia="Arial" w:hAnsi="Arial"/>
-                <w:b w:val="false"/>
-                <w:bCs w:val="false"/>
-                <w:i w:val="false"/>
-                <w:iCs w:val="false"/>
-                <w:color w:val="000000"/>
-                <w:sz w:val="18"/>
-                <w:szCs w:val="18"/>
-              </w:rPr>
-              <w:t xml:space="preserve"/>
+              <w:spacing w:after="40" w:before="0"/>
+              <w:jc w:val="left"/>
+            </w:pPr>
+            <w:r>
+              <w:rPr>
+                <w:rFonts w:ascii="Arial" w:cs="Arial" w:eastAsia="Arial" w:hAnsi="Arial"/>
+                <w:b w:val="false"/>
+                <w:bCs w:val="false"/>
+                <w:i w:val="false"/>
+                <w:iCs w:val="false"/>
+                <w:color w:val="000000"/>
+                <w:sz w:val="18"/>
+                <w:szCs w:val="18"/>
+              </w:rPr>
+              <w:t xml:space="preserve">The class master tally makes individual team data into collective evidence — a scientific norm. The dichotomous key introduces taxonomic reasoning as a tool for making sense of observed diversity. The explicit bridging question — 'what has to happen next?' — positions Lesson 4 as the logical answer to a question learners have now generated from their own evidence.</w:t>
             </w:r>
           </w:p>
         </w:tc>
@@ -10441,21 +10423,21 @@
           </w:tcPr>
           <w:p>
             <w:pPr>
-              <w:spacing w:after="60" w:before="0"/>
-              <w:jc w:val="left"/>
-            </w:pPr>
-            <w:r>
-              <w:rPr>
-                <w:rFonts w:ascii="Arial" w:cs="Arial" w:eastAsia="Arial" w:hAnsi="Arial"/>
-                <w:b w:val="false"/>
-                <w:bCs w:val="false"/>
-                <w:i w:val="false"/>
-                <w:iCs w:val="false"/>
-                <w:color w:val="000000"/>
-                <w:sz w:val="18"/>
-                <w:szCs w:val="18"/>
-              </w:rPr>
-              <w:t xml:space="preserve"/>
+              <w:spacing w:after="40" w:before="0"/>
+              <w:jc w:val="left"/>
+            </w:pPr>
+            <w:r>
+              <w:rPr>
+                <w:rFonts w:ascii="Arial" w:cs="Arial" w:eastAsia="Arial" w:hAnsi="Arial"/>
+                <w:b w:val="false"/>
+                <w:bCs w:val="false"/>
+                <w:i w:val="false"/>
+                <w:iCs w:val="false"/>
+                <w:color w:val="000000"/>
+                <w:sz w:val="18"/>
+                <w:szCs w:val="18"/>
+              </w:rPr>
+              <w:t xml:space="preserve">Teacher checks key pathways recorded in notebooks: are learners recording which feature at each couplet led them to their choice, or just writing the final name? Correct procedure is to record both steps. Exit check: each learner writes one sentence answering 'What did you observe today that the preserved butterfly cannot show us — and what can it show that our live catch cannot?'</w:t>
             </w:r>
           </w:p>
         </w:tc>
@@ -10507,21 +10489,21 @@
           </w:tcPr>
           <w:p>
             <w:pPr>
-              <w:spacing w:after="60" w:before="0"/>
-              <w:jc w:val="left"/>
-            </w:pPr>
-            <w:r>
-              <w:rPr>
-                <w:rFonts w:ascii="Arial" w:cs="Arial" w:eastAsia="Arial" w:hAnsi="Arial"/>
-                <w:b w:val="false"/>
-                <w:bCs w:val="false"/>
-                <w:i w:val="false"/>
-                <w:iCs w:val="false"/>
-                <w:color w:val="000000"/>
-                <w:sz w:val="18"/>
-                <w:szCs w:val="18"/>
-              </w:rPr>
-              <w:t xml:space="preserve"/>
+              <w:spacing w:after="40" w:before="0"/>
+              <w:jc w:val="left"/>
+            </w:pPr>
+            <w:r>
+              <w:rPr>
+                <w:rFonts w:ascii="Arial" w:cs="Arial" w:eastAsia="Arial" w:hAnsi="Arial"/>
+                <w:b w:val="false"/>
+                <w:bCs w:val="false"/>
+                <w:i w:val="false"/>
+                <w:iCs w:val="false"/>
+                <w:color w:val="000000"/>
+                <w:sz w:val="18"/>
+                <w:szCs w:val="18"/>
+              </w:rPr>
+              <w:t xml:space="preserve">Each team writes one new question on a sticky note (or piece of paper if sticky notes are unavailable) generated by todays field experience and adds it to the class Driving Question Board begun in Lesson 1. Questions are read aloud briefly. The teacher then highlights two or three questions that the class will specifically investigate in Lessons 4 and 5, creating explicit continuity.</w:t>
             </w:r>
           </w:p>
         </w:tc>
@@ -10557,7 +10539,7 @@
             <w:pPr>
               <w:spacing w:after="20" w:before="0"/>
             </w:pPr>
-            <w:hyperlink w:history="1" r:id="rId2nio6x2bf4a6uthkx8hsk">
+            <w:hyperlink w:history="1" r:id="rIdgdgbxecbw2tebq0bi5wlg">
               <w:r>
                 <w:rPr>
                   <w:rFonts w:ascii="Arial" w:cs="Arial" w:eastAsia="Arial" w:hAnsi="Arial"/>
@@ -10566,7 +10548,7 @@
                   <w:szCs w:val="16"/>
                   <w:u w:val="single" w:color="2E75B6"/>
                 </w:rPr>
-                <w:t xml:space="preserve">Genetics vocabulary</w:t>
+                <w:t xml:space="preserve">Strategy in solving quadratic equations</w:t>
               </w:r>
             </w:hyperlink>
           </w:p>
@@ -10590,7 +10572,7 @@
               <w:spacing w:after="10" w:before="0"/>
               <w:ind w:left="120"/>
             </w:pPr>
-            <w:hyperlink w:history="1" r:id="rIdphuuvekaa6a2rqv16_bkf">
+            <w:hyperlink w:history="1" r:id="rId_7lmxdjngxs6gr6ge3gsd">
               <w:r>
                 <w:rPr>
                   <w:rFonts w:ascii="Arial" w:cs="Arial" w:eastAsia="Arial" w:hAnsi="Arial"/>
@@ -10628,14 +10610,14 @@
                 <w:sz w:val="16"/>
                 <w:szCs w:val="16"/>
               </w:rPr>
-              <w:t xml:space="preserve">📖 HTML:</w:t>
+              <w:t xml:space="preserve">📖 PDF:</w:t>
             </w:r>
           </w:p>
           <w:p>
             <w:pPr>
               <w:spacing w:after="20" w:before="0"/>
             </w:pPr>
-            <w:hyperlink w:history="1" r:id="rIdf962tdjhnd5xj5lrzmcvo">
+            <w:hyperlink w:history="1" r:id="rId5v2ayo8rdhgdflp2z31mv">
               <w:r>
                 <w:rPr>
                   <w:rFonts w:ascii="Arial" w:cs="Arial" w:eastAsia="Arial" w:hAnsi="Arial"/>
@@ -10644,7 +10626,7 @@
                   <w:szCs w:val="16"/>
                   <w:u w:val="single" w:color="2E75B6"/>
                 </w:rPr>
-                <w:t xml:space="preserve">Build the complementary DNA strand! (PLIX)</w:t>
+                <w:t xml:space="preserve">The Ecological Cost ..:Activity 2, Teacher Notes &amp; Answer Key: What Do Plants and Animals Do With Energy?</w:t>
               </w:r>
             </w:hyperlink>
           </w:p>
@@ -10660,7 +10642,7 @@
                 <w:sz w:val="14"/>
                 <w:szCs w:val="14"/>
               </w:rPr>
-              <w:t xml:space="preserve">Source: CK-12</w:t>
+              <w:t xml:space="preserve">Source: MIT Blossoms</w:t>
             </w:r>
           </w:p>
           <w:p>
@@ -10668,7 +10650,7 @@
               <w:spacing w:after="10" w:before="0"/>
               <w:ind w:left="120"/>
             </w:pPr>
-            <w:hyperlink w:history="1" r:id="rIdzhoifjhq-wannkao3psvk">
+            <w:hyperlink w:history="1" r:id="rIduvpwi5z573skmmqfjpsz9">
               <w:r>
                 <w:rPr>
                   <w:rFonts w:ascii="Arial" w:cs="Arial" w:eastAsia="Arial" w:hAnsi="Arial"/>
@@ -10696,21 +10678,21 @@
           </w:tcPr>
           <w:p>
             <w:pPr>
-              <w:spacing w:after="60" w:before="0"/>
-              <w:jc w:val="left"/>
-            </w:pPr>
-            <w:r>
-              <w:rPr>
-                <w:rFonts w:ascii="Arial" w:cs="Arial" w:eastAsia="Arial" w:hAnsi="Arial"/>
-                <w:b w:val="false"/>
-                <w:bCs w:val="false"/>
-                <w:i w:val="false"/>
-                <w:iCs w:val="false"/>
-                <w:color w:val="000000"/>
-                <w:sz w:val="18"/>
-                <w:szCs w:val="18"/>
-              </w:rPr>
-              <w:t xml:space="preserve"/>
+              <w:spacing w:after="40" w:before="0"/>
+              <w:jc w:val="left"/>
+            </w:pPr>
+            <w:r>
+              <w:rPr>
+                <w:rFonts w:ascii="Arial" w:cs="Arial" w:eastAsia="Arial" w:hAnsi="Arial"/>
+                <w:b w:val="false"/>
+                <w:bCs w:val="false"/>
+                <w:i w:val="false"/>
+                <w:iCs w:val="false"/>
+                <w:color w:val="000000"/>
+                <w:sz w:val="18"/>
+                <w:szCs w:val="18"/>
+              </w:rPr>
+              <w:t xml:space="preserve">Prompt teams that are stuck by asking: 'You found a millipede alive. You want it in your project collection in three weeks. What do you not yet know how to do?' This scaffolds question generation without giving away content. After sticky notes are placed, point to the Lesson 1 initial predictions still on the board and ask: 'Has anything you observed today changed your thinking about why the butterfly survived and the grasshopper did not?' Allow 30 SECONDS WAIT TIME. Acknowledge responses without evaluating them as right or wrong — the full explanation comes in Lesson 7.</w:t>
             </w:r>
           </w:p>
         </w:tc>
@@ -10728,21 +10710,21 @@
           </w:tcPr>
           <w:p>
             <w:pPr>
-              <w:spacing w:after="60" w:before="0"/>
-              <w:jc w:val="left"/>
-            </w:pPr>
-            <w:r>
-              <w:rPr>
-                <w:rFonts w:ascii="Arial" w:cs="Arial" w:eastAsia="Arial" w:hAnsi="Arial"/>
-                <w:b w:val="false"/>
-                <w:bCs w:val="false"/>
-                <w:i w:val="false"/>
-                <w:iCs w:val="false"/>
-                <w:color w:val="000000"/>
-                <w:sz w:val="18"/>
-                <w:szCs w:val="18"/>
-              </w:rPr>
-              <w:t xml:space="preserve"/>
+              <w:spacing w:after="40" w:before="0"/>
+              <w:jc w:val="left"/>
+            </w:pPr>
+            <w:r>
+              <w:rPr>
+                <w:rFonts w:ascii="Arial" w:cs="Arial" w:eastAsia="Arial" w:hAnsi="Arial"/>
+                <w:b w:val="false"/>
+                <w:bCs w:val="false"/>
+                <w:i w:val="false"/>
+                <w:iCs w:val="false"/>
+                <w:color w:val="000000"/>
+                <w:sz w:val="18"/>
+                <w:szCs w:val="18"/>
+              </w:rPr>
+              <w:t xml:space="preserve">Adding new questions to the DQB makes visible the gap between current understanding and full explanation, sustaining inquiry motivation. Connecting new questions to Lesson 1 predictions shows learners that their thinking is evolving — a metacognitive move central to the storyline.</w:t>
             </w:r>
           </w:p>
         </w:tc>
@@ -10760,21 +10742,21 @@
           </w:tcPr>
           <w:p>
             <w:pPr>
-              <w:spacing w:after="60" w:before="0"/>
-              <w:jc w:val="left"/>
-            </w:pPr>
-            <w:r>
-              <w:rPr>
-                <w:rFonts w:ascii="Arial" w:cs="Arial" w:eastAsia="Arial" w:hAnsi="Arial"/>
-                <w:b w:val="false"/>
-                <w:bCs w:val="false"/>
-                <w:i w:val="false"/>
-                <w:iCs w:val="false"/>
-                <w:color w:val="000000"/>
-                <w:sz w:val="18"/>
-                <w:szCs w:val="18"/>
-              </w:rPr>
-              <w:t xml:space="preserve"/>
+              <w:spacing w:after="40" w:before="0"/>
+              <w:jc w:val="left"/>
+            </w:pPr>
+            <w:r>
+              <w:rPr>
+                <w:rFonts w:ascii="Arial" w:cs="Arial" w:eastAsia="Arial" w:hAnsi="Arial"/>
+                <w:b w:val="false"/>
+                <w:bCs w:val="false"/>
+                <w:i w:val="false"/>
+                <w:iCs w:val="false"/>
+                <w:color w:val="000000"/>
+                <w:sz w:val="18"/>
+                <w:szCs w:val="18"/>
+              </w:rPr>
+              <w:t xml:space="preserve">Quality of DQB questions: are they mechanistic ('How does ethanol stop a beetle from rotting?') or purely procedural ('What do we do next?')? Teacher mentally notes which teams are moving toward causal reasoning and which still need scaffolding.</w:t>
             </w:r>
           </w:p>
         </w:tc>
@@ -10826,21 +10808,21 @@
           </w:tcPr>
           <w:p>
             <w:pPr>
-              <w:spacing w:after="60" w:before="0"/>
-              <w:jc w:val="left"/>
-            </w:pPr>
-            <w:r>
-              <w:rPr>
-                <w:rFonts w:ascii="Arial" w:cs="Arial" w:eastAsia="Arial" w:hAnsi="Arial"/>
-                <w:b w:val="false"/>
-                <w:bCs w:val="false"/>
-                <w:i w:val="false"/>
-                <w:iCs w:val="false"/>
-                <w:color w:val="000000"/>
-                <w:sz w:val="18"/>
-                <w:szCs w:val="18"/>
-              </w:rPr>
-              <w:t xml:space="preserve"/>
+              <w:spacing w:after="40" w:before="0"/>
+              <w:jc w:val="left"/>
+            </w:pPr>
+            <w:r>
+              <w:rPr>
+                <w:rFonts w:ascii="Arial" w:cs="Arial" w:eastAsia="Arial" w:hAnsi="Arial"/>
+                <w:b w:val="false"/>
+                <w:bCs w:val="false"/>
+                <w:i w:val="false"/>
+                <w:iCs w:val="false"/>
+                <w:color w:val="000000"/>
+                <w:sz w:val="18"/>
+                <w:szCs w:val="18"/>
+              </w:rPr>
+              <w:t xml:space="preserve">In the final 3 minutes, each learner adds one annotation to their initial model from Lesson 1 using a different coloured pen or pencil. The annotation should reflect something observed today in the field that was not in the original model — for example, the type of organism found, the microhabitat, or a new idea about what makes an organism easy or hard to preserve. Learners are not expected to have full scientific explanations yet; the annotation is an evidence marker showing that the model is a living document.</w:t>
             </w:r>
           </w:p>
         </w:tc>
@@ -10876,7 +10858,7 @@
             <w:pPr>
               <w:spacing w:after="20" w:before="0"/>
             </w:pPr>
-            <w:hyperlink w:history="1" r:id="rIdxvsezzynfcaia9xltzdo5">
+            <w:hyperlink w:history="1" r:id="rId3pkgovg8a51xmhwegbvti">
               <w:r>
                 <w:rPr>
                   <w:rFonts w:ascii="Arial" w:cs="Arial" w:eastAsia="Arial" w:hAnsi="Arial"/>
@@ -10885,7 +10867,7 @@
                   <w:szCs w:val="16"/>
                   <w:u w:val="single" w:color="2E75B6"/>
                 </w:rPr>
-                <w:t xml:space="preserve">Genetics vocabulary</w:t>
+                <w:t xml:space="preserve">Strategy in solving quadratic equations</w:t>
               </w:r>
             </w:hyperlink>
           </w:p>
@@ -10909,7 +10891,7 @@
               <w:spacing w:after="10" w:before="0"/>
               <w:ind w:left="120"/>
             </w:pPr>
-            <w:hyperlink w:history="1" r:id="rIdopiylxzgwoevqo7udimrc">
+            <w:hyperlink w:history="1" r:id="rId4hojeeng9a67bgypwuemv">
               <w:r>
                 <w:rPr>
                   <w:rFonts w:ascii="Arial" w:cs="Arial" w:eastAsia="Arial" w:hAnsi="Arial"/>
@@ -10947,14 +10929,14 @@
                 <w:sz w:val="16"/>
                 <w:szCs w:val="16"/>
               </w:rPr>
-              <w:t xml:space="preserve">📖 HTML:</w:t>
+              <w:t xml:space="preserve">📖 PDF:</w:t>
             </w:r>
           </w:p>
           <w:p>
             <w:pPr>
               <w:spacing w:after="20" w:before="0"/>
             </w:pPr>
-            <w:hyperlink w:history="1" r:id="rIdcwjwxusyvgt-0cp-f2iq3">
+            <w:hyperlink w:history="1" r:id="rId-jbo8c_9r7phweqq1yj6w">
               <w:r>
                 <w:rPr>
                   <w:rFonts w:ascii="Arial" w:cs="Arial" w:eastAsia="Arial" w:hAnsi="Arial"/>
@@ -10963,7 +10945,7 @@
                   <w:szCs w:val="16"/>
                   <w:u w:val="single" w:color="2E75B6"/>
                 </w:rPr>
-                <w:t xml:space="preserve">Build the complementary DNA strand! (PLIX)</w:t>
+                <w:t xml:space="preserve">The Ecological Cost ..:Activity 2, Teacher Notes &amp; Answer Key: What Do Plants and Animals Do With Energy?</w:t>
               </w:r>
             </w:hyperlink>
           </w:p>
@@ -10979,7 +10961,7 @@
                 <w:sz w:val="14"/>
                 <w:szCs w:val="14"/>
               </w:rPr>
-              <w:t xml:space="preserve">Source: CK-12</w:t>
+              <w:t xml:space="preserve">Source: MIT Blossoms</w:t>
             </w:r>
           </w:p>
           <w:p>
@@ -10987,7 +10969,7 @@
               <w:spacing w:after="10" w:before="0"/>
               <w:ind w:left="120"/>
             </w:pPr>
-            <w:hyperlink w:history="1" r:id="rIdeo6gr3u61tkgp7nlgdx2t">
+            <w:hyperlink w:history="1" r:id="rId6sgtxliby9juusmwrkzyb">
               <w:r>
                 <w:rPr>
                   <w:rFonts w:ascii="Arial" w:cs="Arial" w:eastAsia="Arial" w:hAnsi="Arial"/>
@@ -11015,21 +10997,21 @@
           </w:tcPr>
           <w:p>
             <w:pPr>
-              <w:spacing w:after="60" w:before="0"/>
-              <w:jc w:val="left"/>
-            </w:pPr>
-            <w:r>
-              <w:rPr>
-                <w:rFonts w:ascii="Arial" w:cs="Arial" w:eastAsia="Arial" w:hAnsi="Arial"/>
-                <w:b w:val="false"/>
-                <w:bCs w:val="false"/>
-                <w:i w:val="false"/>
-                <w:iCs w:val="false"/>
-                <w:color w:val="000000"/>
-                <w:sz w:val="18"/>
-                <w:szCs w:val="18"/>
-              </w:rPr>
-              <w:t xml:space="preserve"/>
+              <w:spacing w:after="40" w:before="0"/>
+              <w:jc w:val="left"/>
+            </w:pPr>
+            <w:r>
+              <w:rPr>
+                <w:rFonts w:ascii="Arial" w:cs="Arial" w:eastAsia="Arial" w:hAnsi="Arial"/>
+                <w:b w:val="false"/>
+                <w:bCs w:val="false"/>
+                <w:i w:val="false"/>
+                <w:iCs w:val="false"/>
+                <w:color w:val="000000"/>
+                <w:sz w:val="18"/>
+                <w:szCs w:val="18"/>
+              </w:rPr>
+              <w:t xml:space="preserve">Say: 'Look at your Lesson 1 model. You drew a prediction about why the butterfly survived. You now have real organisms in front of you that you collected yourself. Add one thing you observed today that your model did not include — do not erase anything, just add. Science models are updated with new evidence, not replaced.' Allow learners to write silently for 2 minutes. Collect or photograph models for teacher reference before Lesson 7 when full model revision occurs.</w:t>
             </w:r>
           </w:p>
         </w:tc>
@@ -11047,21 +11029,21 @@
           </w:tcPr>
           <w:p>
             <w:pPr>
-              <w:spacing w:after="60" w:before="0"/>
-              <w:jc w:val="left"/>
-            </w:pPr>
-            <w:r>
-              <w:rPr>
-                <w:rFonts w:ascii="Arial" w:cs="Arial" w:eastAsia="Arial" w:hAnsi="Arial"/>
-                <w:b w:val="false"/>
-                <w:bCs w:val="false"/>
-                <w:i w:val="false"/>
-                <w:iCs w:val="false"/>
-                <w:color w:val="000000"/>
-                <w:sz w:val="18"/>
-                <w:szCs w:val="18"/>
-              </w:rPr>
-              <w:t xml:space="preserve"/>
+              <w:spacing w:after="40" w:before="0"/>
+              <w:jc w:val="left"/>
+            </w:pPr>
+            <w:r>
+              <w:rPr>
+                <w:rFonts w:ascii="Arial" w:cs="Arial" w:eastAsia="Arial" w:hAnsi="Arial"/>
+                <w:b w:val="false"/>
+                <w:bCs w:val="false"/>
+                <w:i w:val="false"/>
+                <w:iCs w:val="false"/>
+                <w:color w:val="000000"/>
+                <w:sz w:val="18"/>
+                <w:szCs w:val="18"/>
+              </w:rPr>
+              <w:t xml:space="preserve">Annotating rather than redrawing the original model makes conceptual change visible and preserves the original thinking as a baseline. This is consistent with how scientists revise models iteratively rather than discarding them entirely.</w:t>
             </w:r>
           </w:p>
         </w:tc>
@@ -11079,21 +11061,21 @@
           </w:tcPr>
           <w:p>
             <w:pPr>
-              <w:spacing w:after="60" w:before="0"/>
-              <w:jc w:val="left"/>
-            </w:pPr>
-            <w:r>
-              <w:rPr>
-                <w:rFonts w:ascii="Arial" w:cs="Arial" w:eastAsia="Arial" w:hAnsi="Arial"/>
-                <w:b w:val="false"/>
-                <w:bCs w:val="false"/>
-                <w:i w:val="false"/>
-                <w:iCs w:val="false"/>
-                <w:color w:val="000000"/>
-                <w:sz w:val="18"/>
-                <w:szCs w:val="18"/>
-              </w:rPr>
-              <w:t xml:space="preserve"/>
+              <w:spacing w:after="40" w:before="0"/>
+              <w:jc w:val="left"/>
+            </w:pPr>
+            <w:r>
+              <w:rPr>
+                <w:rFonts w:ascii="Arial" w:cs="Arial" w:eastAsia="Arial" w:hAnsi="Arial"/>
+                <w:b w:val="false"/>
+                <w:bCs w:val="false"/>
+                <w:i w:val="false"/>
+                <w:iCs w:val="false"/>
+                <w:color w:val="000000"/>
+                <w:sz w:val="18"/>
+                <w:szCs w:val="18"/>
+              </w:rPr>
+              <w:t xml:space="preserve">Teacher scans annotations: is the new evidence connected to the butterfly-grasshopper phenomenon in any way, or is it an isolated observation? A strong annotation might read: 'The beetle I caught had a hard outer shell — maybe that is why some insects preserve differently from soft worms.' This level of reasoning indicates readiness for Lessons 4 and 5.</w:t>
             </w:r>
           </w:p>
         </w:tc>
@@ -11172,21 +11154,21 @@
           </w:tcPr>
           <w:p>
             <w:pPr>
-              <w:spacing w:after="60" w:before="0"/>
-              <w:jc w:val="left"/>
-            </w:pPr>
-            <w:r>
-              <w:rPr>
-                <w:rFonts w:ascii="Arial" w:cs="Arial" w:eastAsia="Arial" w:hAnsi="Arial"/>
-                <w:b w:val="false"/>
-                <w:bCs w:val="false"/>
-                <w:i w:val="false"/>
-                <w:iCs w:val="false"/>
-                <w:color w:val="000000"/>
-                <w:sz w:val="18"/>
-                <w:szCs w:val="18"/>
-              </w:rPr>
-              <w:t xml:space="preserve"/>
+              <w:spacing w:after="40" w:before="0"/>
+              <w:jc w:val="left"/>
+            </w:pPr>
+            <w:r>
+              <w:rPr>
+                <w:rFonts w:ascii="Arial" w:cs="Arial" w:eastAsia="Arial" w:hAnsi="Arial"/>
+                <w:b w:val="false"/>
+                <w:bCs w:val="false"/>
+                <w:i w:val="false"/>
+                <w:iCs w:val="false"/>
+                <w:color w:val="000000"/>
+                <w:sz w:val="18"/>
+                <w:szCs w:val="18"/>
+              </w:rPr>
+              <w:t xml:space="preserve">After the lesson, consider: (1) Did all teams produce a tally with enough descriptive detail to use the dichotomous key — if not, what scaffolding is needed before Lesson 4? (2) Did learners handle organisms with genuine care, or did some treat the activity as a game of catching and discarding? This attitude matters for the ethical discussion in Lesson 8. (3) Were the school compound microhabitats productive — if very few organisms were found, consider whether the lesson needs to be repeated after rain when soil fauna are more active, or whether a supplementary image-based sorting activity should be prepared as a backup for Lesson 4. (4) Which learners demonstrated scientific language in their tally descriptions or DQB questions? These learners can be peer-mentors during the dichotomous key activity in Lesson 4 processing work. (5) Did the lesson advance the driving question concretely — can you point to a specific moment when learners connected what they collected to the fate of the grasshopper in the bag? If not, the Explain Phase bridging question needs to be revisited at the start of Lesson 4.</w:t>
             </w:r>
           </w:p>
         </w:tc>
@@ -11299,21 +11281,21 @@
           </w:tcPr>
           <w:p>
             <w:pPr>
-              <w:spacing w:after="60" w:before="0"/>
-              <w:jc w:val="left"/>
-            </w:pPr>
-            <w:r>
-              <w:rPr>
-                <w:rFonts w:ascii="Arial" w:cs="Arial" w:eastAsia="Arial" w:hAnsi="Arial"/>
-                <w:b w:val="false"/>
-                <w:bCs w:val="false"/>
-                <w:i w:val="false"/>
-                <w:iCs w:val="false"/>
-                <w:color w:val="000000"/>
-                <w:sz w:val="18"/>
-                <w:szCs w:val="18"/>
-              </w:rPr>
-              <w:t xml:space="preserve"/>
+              <w:spacing w:after="40" w:before="0"/>
+              <w:jc w:val="left"/>
+            </w:pPr>
+            <w:r>
+              <w:rPr>
+                <w:rFonts w:ascii="Arial" w:cs="Arial" w:eastAsia="Arial" w:hAnsi="Arial"/>
+                <w:b w:val="false"/>
+                <w:bCs w:val="false"/>
+                <w:i w:val="false"/>
+                <w:iCs w:val="false"/>
+                <w:color w:val="000000"/>
+                <w:sz w:val="18"/>
+                <w:szCs w:val="18"/>
+              </w:rPr>
+              <w:t xml:space="preserve">In the school compound we observed invertebrates living in at least four distinct microhabitats: bare soil, grass, leaf litter, and shrub/hedge edges. We recorded organism descriptions using tally charts and found that different tools were needed for different zones, confirming our Lesson 2 predictions about tool-organism matching.</w:t>
             </w:r>
           </w:p>
         </w:tc>
@@ -11365,21 +11347,21 @@
           </w:tcPr>
           <w:p>
             <w:pPr>
-              <w:spacing w:after="60" w:before="0"/>
-              <w:jc w:val="left"/>
-            </w:pPr>
-            <w:r>
-              <w:rPr>
-                <w:rFonts w:ascii="Arial" w:cs="Arial" w:eastAsia="Arial" w:hAnsi="Arial"/>
-                <w:b w:val="false"/>
-                <w:bCs w:val="false"/>
-                <w:i w:val="false"/>
-                <w:iCs w:val="false"/>
-                <w:color w:val="000000"/>
-                <w:sz w:val="18"/>
-                <w:szCs w:val="18"/>
-              </w:rPr>
-              <w:t xml:space="preserve"/>
+              <w:spacing w:after="40" w:before="0"/>
+              <w:jc w:val="left"/>
+            </w:pPr>
+            <w:r>
+              <w:rPr>
+                <w:rFonts w:ascii="Arial" w:cs="Arial" w:eastAsia="Arial" w:hAnsi="Arial"/>
+                <w:b w:val="false"/>
+                <w:bCs w:val="false"/>
+                <w:i w:val="false"/>
+                <w:iCs w:val="false"/>
+                <w:color w:val="000000"/>
+                <w:sz w:val="18"/>
+                <w:szCs w:val="18"/>
+              </w:rPr>
+              <w:t xml:space="preserve">We learned that collecting a specimen without damaging it requires planning: the right tool for the microhabitat, careful transfer using forceps, and immediate recording before memory fades. We also began to learn that organisms we collected can be sorted using a dichotomous key by observing visible features such as leg number, body segments, and wing presence.</w:t>
             </w:r>
           </w:p>
         </w:tc>
@@ -11431,21 +11413,21 @@
           </w:tcPr>
           <w:p>
             <w:pPr>
-              <w:spacing w:after="60" w:before="0"/>
-              <w:jc w:val="left"/>
-            </w:pPr>
-            <w:r>
-              <w:rPr>
-                <w:rFonts w:ascii="Arial" w:cs="Arial" w:eastAsia="Arial" w:hAnsi="Arial"/>
-                <w:b w:val="false"/>
-                <w:bCs w:val="false"/>
-                <w:i w:val="false"/>
-                <w:iCs w:val="false"/>
-                <w:color w:val="000000"/>
-                <w:sz w:val="18"/>
-                <w:szCs w:val="18"/>
-              </w:rPr>
-              <w:t xml:space="preserve"/>
+              <w:spacing w:after="40" w:before="0"/>
+              <w:jc w:val="left"/>
+            </w:pPr>
+            <w:r>
+              <w:rPr>
+                <w:rFonts w:ascii="Arial" w:cs="Arial" w:eastAsia="Arial" w:hAnsi="Arial"/>
+                <w:b w:val="false"/>
+                <w:bCs w:val="false"/>
+                <w:i w:val="false"/>
+                <w:iCs w:val="false"/>
+                <w:color w:val="000000"/>
+                <w:sz w:val="18"/>
+                <w:szCs w:val="18"/>
+              </w:rPr>
+              <w:t xml:space="preserve">We can now explain that the first reason the grasshopper decayed while the butterfly survived is that the butterfly was handled correctly from the moment of collection — not crushed, not left in a closed warm container, and processed promptly. Today we practised that same first step: collecting organisms intact. We still need to explain what happens after collection to stop decomposition, which is what Lessons 4 and 5 will address.</w:t>
             </w:r>
           </w:p>
         </w:tc>
@@ -12690,7 +12672,7 @@
             <w:pPr>
               <w:spacing w:after="20" w:before="0"/>
             </w:pPr>
-            <w:hyperlink w:history="1" r:id="rId7ff2hf4-qobnonvw5xzuq">
+            <w:hyperlink w:history="1" r:id="rIdno-btut8esmxq6vfqisrx">
               <w:r>
                 <w:rPr>
                   <w:rFonts w:ascii="Arial" w:cs="Arial" w:eastAsia="Arial" w:hAnsi="Arial"/>
@@ -12723,7 +12705,7 @@
               <w:spacing w:after="10" w:before="0"/>
               <w:ind w:left="120"/>
             </w:pPr>
-            <w:hyperlink w:history="1" r:id="rIdtj_-dszgpn1zpaby4th_w">
+            <w:hyperlink w:history="1" r:id="rIdospi_5sxbdg_8rhf_d8mm">
               <w:r>
                 <w:rPr>
                   <w:rFonts w:ascii="Arial" w:cs="Arial" w:eastAsia="Arial" w:hAnsi="Arial"/>
@@ -12768,7 +12750,7 @@
             <w:pPr>
               <w:spacing w:after="20" w:before="0"/>
             </w:pPr>
-            <w:hyperlink w:history="1" r:id="rIdr8nnqf8bcwwwm0lp6tued">
+            <w:hyperlink w:history="1" r:id="rIdsfggdpmbax8e-i_m89brw">
               <w:r>
                 <w:rPr>
                   <w:rFonts w:ascii="Arial" w:cs="Arial" w:eastAsia="Arial" w:hAnsi="Arial"/>
@@ -12801,7 +12783,7 @@
               <w:spacing w:after="10" w:before="0"/>
               <w:ind w:left="120"/>
             </w:pPr>
-            <w:hyperlink w:history="1" r:id="rIdy9y-uxjpaeenkc1mfj996">
+            <w:hyperlink w:history="1" r:id="rIdreoi2nmbrrzys4qf1yvid">
               <w:r>
                 <w:rPr>
                   <w:rFonts w:ascii="Arial" w:cs="Arial" w:eastAsia="Arial" w:hAnsi="Arial"/>
@@ -13009,7 +12991,7 @@
             <w:pPr>
               <w:spacing w:after="20" w:before="0"/>
             </w:pPr>
-            <w:hyperlink w:history="1" r:id="rId09m-essm7htxidhx1n6c3">
+            <w:hyperlink w:history="1" r:id="rIdclr6rad1i7ewc-hpq4ghe">
               <w:r>
                 <w:rPr>
                   <w:rFonts w:ascii="Arial" w:cs="Arial" w:eastAsia="Arial" w:hAnsi="Arial"/>
@@ -13042,7 +13024,7 @@
               <w:spacing w:after="10" w:before="0"/>
               <w:ind w:left="120"/>
             </w:pPr>
-            <w:hyperlink w:history="1" r:id="rIdthamaisigtl7loarf2f51">
+            <w:hyperlink w:history="1" r:id="rIdw70zqme5ucqjrve5mgh7e">
               <w:r>
                 <w:rPr>
                   <w:rFonts w:ascii="Arial" w:cs="Arial" w:eastAsia="Arial" w:hAnsi="Arial"/>
@@ -13087,7 +13069,7 @@
             <w:pPr>
               <w:spacing w:after="20" w:before="0"/>
             </w:pPr>
-            <w:hyperlink w:history="1" r:id="rIdjov44qfqy8uxy7y7wgs1k">
+            <w:hyperlink w:history="1" r:id="rId8hmmxfxy8iwclz5mfd2dk">
               <w:r>
                 <w:rPr>
                   <w:rFonts w:ascii="Arial" w:cs="Arial" w:eastAsia="Arial" w:hAnsi="Arial"/>
@@ -13120,7 +13102,7 @@
               <w:spacing w:after="10" w:before="0"/>
               <w:ind w:left="120"/>
             </w:pPr>
-            <w:hyperlink w:history="1" r:id="rId8spmgihem79srvusqp2b5">
+            <w:hyperlink w:history="1" r:id="rId8kgacqhpjgzqzrkufr7bs">
               <w:r>
                 <w:rPr>
                   <w:rFonts w:ascii="Arial" w:cs="Arial" w:eastAsia="Arial" w:hAnsi="Arial"/>
@@ -13328,7 +13310,7 @@
             <w:pPr>
               <w:spacing w:after="20" w:before="0"/>
             </w:pPr>
-            <w:hyperlink w:history="1" r:id="rIdcbucaikajx7hiltvlg_kp">
+            <w:hyperlink w:history="1" r:id="rIdnndwcns4isx2aec2_uvmy">
               <w:r>
                 <w:rPr>
                   <w:rFonts w:ascii="Arial" w:cs="Arial" w:eastAsia="Arial" w:hAnsi="Arial"/>
@@ -13361,7 +13343,7 @@
               <w:spacing w:after="10" w:before="0"/>
               <w:ind w:left="120"/>
             </w:pPr>
-            <w:hyperlink w:history="1" r:id="rIdrf31i0c-mnooxl19pen2m">
+            <w:hyperlink w:history="1" r:id="rIdusz9cq1jmzier-q-t-cf_">
               <w:r>
                 <w:rPr>
                   <w:rFonts w:ascii="Arial" w:cs="Arial" w:eastAsia="Arial" w:hAnsi="Arial"/>
@@ -13406,7 +13388,7 @@
             <w:pPr>
               <w:spacing w:after="20" w:before="0"/>
             </w:pPr>
-            <w:hyperlink w:history="1" r:id="rIdm6item40k-6j7wzhi2xbv">
+            <w:hyperlink w:history="1" r:id="rIdblny-u7sag3zwcoxwvvos">
               <w:r>
                 <w:rPr>
                   <w:rFonts w:ascii="Arial" w:cs="Arial" w:eastAsia="Arial" w:hAnsi="Arial"/>
@@ -13439,7 +13421,7 @@
               <w:spacing w:after="10" w:before="0"/>
               <w:ind w:left="120"/>
             </w:pPr>
-            <w:hyperlink w:history="1" r:id="rIdrxtcx4jwz6wgglrxikcxr">
+            <w:hyperlink w:history="1" r:id="rIdc7jedk8co17e02l8_dxiv">
               <w:r>
                 <w:rPr>
                   <w:rFonts w:ascii="Arial" w:cs="Arial" w:eastAsia="Arial" w:hAnsi="Arial"/>
@@ -13647,7 +13629,7 @@
             <w:pPr>
               <w:spacing w:after="20" w:before="0"/>
             </w:pPr>
-            <w:hyperlink w:history="1" r:id="rIdl7fih1ng8l6txpgq6eccb">
+            <w:hyperlink w:history="1" r:id="rIdvkjtf_gu02vum7ejohgcv">
               <w:r>
                 <w:rPr>
                   <w:rFonts w:ascii="Arial" w:cs="Arial" w:eastAsia="Arial" w:hAnsi="Arial"/>
@@ -13680,7 +13662,7 @@
               <w:spacing w:after="10" w:before="0"/>
               <w:ind w:left="120"/>
             </w:pPr>
-            <w:hyperlink w:history="1" r:id="rIdnictnmx4e15hfnjpkj7q1">
+            <w:hyperlink w:history="1" r:id="rIdoqyfp5wj04atslfdeov7g">
               <w:r>
                 <w:rPr>
                   <w:rFonts w:ascii="Arial" w:cs="Arial" w:eastAsia="Arial" w:hAnsi="Arial"/>
@@ -13725,7 +13707,7 @@
             <w:pPr>
               <w:spacing w:after="20" w:before="0"/>
             </w:pPr>
-            <w:hyperlink w:history="1" r:id="rIdw418hnkg9gkmwgan0a9ie">
+            <w:hyperlink w:history="1" r:id="rIdtdqjpp9u5d7_cq21aem6y">
               <w:r>
                 <w:rPr>
                   <w:rFonts w:ascii="Arial" w:cs="Arial" w:eastAsia="Arial" w:hAnsi="Arial"/>
@@ -13758,7 +13740,7 @@
               <w:spacing w:after="10" w:before="0"/>
               <w:ind w:left="120"/>
             </w:pPr>
-            <w:hyperlink w:history="1" r:id="rIdx1ecq2-w1vkzm4tly7tv7">
+            <w:hyperlink w:history="1" r:id="rId7smvn8nztqc4uac4bprmo">
               <w:r>
                 <w:rPr>
                   <w:rFonts w:ascii="Arial" w:cs="Arial" w:eastAsia="Arial" w:hAnsi="Arial"/>
@@ -13966,7 +13948,7 @@
             <w:pPr>
               <w:spacing w:after="20" w:before="0"/>
             </w:pPr>
-            <w:hyperlink w:history="1" r:id="rIdutlhevrptjyi_31n8tkpn">
+            <w:hyperlink w:history="1" r:id="rIdz71zz_0fvnourqfe0h-zw">
               <w:r>
                 <w:rPr>
                   <w:rFonts w:ascii="Arial" w:cs="Arial" w:eastAsia="Arial" w:hAnsi="Arial"/>
@@ -13999,7 +13981,7 @@
               <w:spacing w:after="10" w:before="0"/>
               <w:ind w:left="120"/>
             </w:pPr>
-            <w:hyperlink w:history="1" r:id="rIdf87-xpps3qrfbgsa7cg7t">
+            <w:hyperlink w:history="1" r:id="rIde6sytnmafatdfegyb2zvj">
               <w:r>
                 <w:rPr>
                   <w:rFonts w:ascii="Arial" w:cs="Arial" w:eastAsia="Arial" w:hAnsi="Arial"/>
@@ -14044,7 +14026,7 @@
             <w:pPr>
               <w:spacing w:after="20" w:before="0"/>
             </w:pPr>
-            <w:hyperlink w:history="1" r:id="rIdwkvucmvdxtab1pxjfffs6">
+            <w:hyperlink w:history="1" r:id="rId1kpk4bhaj7mgzjzr0kkd3">
               <w:r>
                 <w:rPr>
                   <w:rFonts w:ascii="Arial" w:cs="Arial" w:eastAsia="Arial" w:hAnsi="Arial"/>
@@ -14077,7 +14059,7 @@
               <w:spacing w:after="10" w:before="0"/>
               <w:ind w:left="120"/>
             </w:pPr>
-            <w:hyperlink w:history="1" r:id="rIdvst5llwd8z4uxefs-hvgz">
+            <w:hyperlink w:history="1" r:id="rId6pq7fefpodehgx02zjo21">
               <w:r>
                 <w:rPr>
                   <w:rFonts w:ascii="Arial" w:cs="Arial" w:eastAsia="Arial" w:hAnsi="Arial"/>
@@ -15856,7 +15838,7 @@
             <w:pPr>
               <w:spacing w:after="20" w:before="0"/>
             </w:pPr>
-            <w:hyperlink w:history="1" r:id="rId96-xmt0cptfs8sv0nlg-u">
+            <w:hyperlink w:history="1" r:id="rIdqy096unawiwtdnnpk77ok">
               <w:r>
                 <w:rPr>
                   <w:rFonts w:ascii="Arial" w:cs="Arial" w:eastAsia="Arial" w:hAnsi="Arial"/>
@@ -15889,7 +15871,7 @@
               <w:spacing w:after="10" w:before="0"/>
               <w:ind w:left="120"/>
             </w:pPr>
-            <w:hyperlink w:history="1" r:id="rIditzhfvuqtompx3y_9am0x">
+            <w:hyperlink w:history="1" r:id="rIdx2eqodnlvcscsumixcxh7">
               <w:r>
                 <w:rPr>
                   <w:rFonts w:ascii="Arial" w:cs="Arial" w:eastAsia="Arial" w:hAnsi="Arial"/>
@@ -15934,7 +15916,7 @@
             <w:pPr>
               <w:spacing w:after="20" w:before="0"/>
             </w:pPr>
-            <w:hyperlink w:history="1" r:id="rIdmbje4z6hqt_sjiswffk-3">
+            <w:hyperlink w:history="1" r:id="rId71qg-mdgp3op6an74p9ui">
               <w:r>
                 <w:rPr>
                   <w:rFonts w:ascii="Arial" w:cs="Arial" w:eastAsia="Arial" w:hAnsi="Arial"/>
@@ -15967,7 +15949,7 @@
               <w:spacing w:after="10" w:before="0"/>
               <w:ind w:left="120"/>
             </w:pPr>
-            <w:hyperlink w:history="1" r:id="rIdajoi3potwlcyginitryyj">
+            <w:hyperlink w:history="1" r:id="rId8_9simkje7hrdg5di4fu1">
               <w:r>
                 <w:rPr>
                   <w:rFonts w:ascii="Arial" w:cs="Arial" w:eastAsia="Arial" w:hAnsi="Arial"/>
@@ -16175,7 +16157,7 @@
             <w:pPr>
               <w:spacing w:after="20" w:before="0"/>
             </w:pPr>
-            <w:hyperlink w:history="1" r:id="rIdhgl-3yyvzkryqrqseepkt">
+            <w:hyperlink w:history="1" r:id="rIdu_cw_vgdrwk4foncbzs7m">
               <w:r>
                 <w:rPr>
                   <w:rFonts w:ascii="Arial" w:cs="Arial" w:eastAsia="Arial" w:hAnsi="Arial"/>
@@ -16208,7 +16190,7 @@
               <w:spacing w:after="10" w:before="0"/>
               <w:ind w:left="120"/>
             </w:pPr>
-            <w:hyperlink w:history="1" r:id="rIdisafstr52_atb3cj2erx8">
+            <w:hyperlink w:history="1" r:id="rIdrgh9benqdmfhbf2-1wj7y">
               <w:r>
                 <w:rPr>
                   <w:rFonts w:ascii="Arial" w:cs="Arial" w:eastAsia="Arial" w:hAnsi="Arial"/>
@@ -16253,7 +16235,7 @@
             <w:pPr>
               <w:spacing w:after="20" w:before="0"/>
             </w:pPr>
-            <w:hyperlink w:history="1" r:id="rId4vwsmv91sb9mvin0nbtx_">
+            <w:hyperlink w:history="1" r:id="rIdbkd445ukqigo9jo4nlqqh">
               <w:r>
                 <w:rPr>
                   <w:rFonts w:ascii="Arial" w:cs="Arial" w:eastAsia="Arial" w:hAnsi="Arial"/>
@@ -16286,7 +16268,7 @@
               <w:spacing w:after="10" w:before="0"/>
               <w:ind w:left="120"/>
             </w:pPr>
-            <w:hyperlink w:history="1" r:id="rIdvfizjv2tmrt94pu4m_v-u">
+            <w:hyperlink w:history="1" r:id="rIdbcwi_stjfuvqlcmlvlxke">
               <w:r>
                 <w:rPr>
                   <w:rFonts w:ascii="Arial" w:cs="Arial" w:eastAsia="Arial" w:hAnsi="Arial"/>
@@ -16494,7 +16476,7 @@
             <w:pPr>
               <w:spacing w:after="20" w:before="0"/>
             </w:pPr>
-            <w:hyperlink w:history="1" r:id="rIdw78zt6qcxu0k-81wbqkty">
+            <w:hyperlink w:history="1" r:id="rIdjhv0woz1aga5ol7owaay3">
               <w:r>
                 <w:rPr>
                   <w:rFonts w:ascii="Arial" w:cs="Arial" w:eastAsia="Arial" w:hAnsi="Arial"/>
@@ -16527,7 +16509,7 @@
               <w:spacing w:after="10" w:before="0"/>
               <w:ind w:left="120"/>
             </w:pPr>
-            <w:hyperlink w:history="1" r:id="rIducrop3xmlmdqfgvrj4w48">
+            <w:hyperlink w:history="1" r:id="rIdi00qccxvzlkes9ltgwsd9">
               <w:r>
                 <w:rPr>
                   <w:rFonts w:ascii="Arial" w:cs="Arial" w:eastAsia="Arial" w:hAnsi="Arial"/>
@@ -16572,7 +16554,7 @@
             <w:pPr>
               <w:spacing w:after="20" w:before="0"/>
             </w:pPr>
-            <w:hyperlink w:history="1" r:id="rIdjohqglxltr3tydmvywz12">
+            <w:hyperlink w:history="1" r:id="rIdzkmdo_qaeoongmcq3eph1">
               <w:r>
                 <w:rPr>
                   <w:rFonts w:ascii="Arial" w:cs="Arial" w:eastAsia="Arial" w:hAnsi="Arial"/>
@@ -16605,7 +16587,7 @@
               <w:spacing w:after="10" w:before="0"/>
               <w:ind w:left="120"/>
             </w:pPr>
-            <w:hyperlink w:history="1" r:id="rIdooevaybgvrjbh435kyj5o">
+            <w:hyperlink w:history="1" r:id="rIdbkoaxz_svcqvm2rnplel2">
               <w:r>
                 <w:rPr>
                   <w:rFonts w:ascii="Arial" w:cs="Arial" w:eastAsia="Arial" w:hAnsi="Arial"/>
@@ -16813,7 +16795,7 @@
             <w:pPr>
               <w:spacing w:after="20" w:before="0"/>
             </w:pPr>
-            <w:hyperlink w:history="1" r:id="rIdxvcqhygh7so8gb0m4olzl">
+            <w:hyperlink w:history="1" r:id="rIdvzcobtquh2wlfqqt4tyo7">
               <w:r>
                 <w:rPr>
                   <w:rFonts w:ascii="Arial" w:cs="Arial" w:eastAsia="Arial" w:hAnsi="Arial"/>
@@ -16846,7 +16828,7 @@
               <w:spacing w:after="10" w:before="0"/>
               <w:ind w:left="120"/>
             </w:pPr>
-            <w:hyperlink w:history="1" r:id="rIdl8kzqdglqseyh8djocjbz">
+            <w:hyperlink w:history="1" r:id="rIdp6dwmwsuewncyuw1z-f-u">
               <w:r>
                 <w:rPr>
                   <w:rFonts w:ascii="Arial" w:cs="Arial" w:eastAsia="Arial" w:hAnsi="Arial"/>
@@ -16891,7 +16873,7 @@
             <w:pPr>
               <w:spacing w:after="20" w:before="0"/>
             </w:pPr>
-            <w:hyperlink w:history="1" r:id="rIderr7b-i94pgesugd1exst">
+            <w:hyperlink w:history="1" r:id="rIdal1qipztilw_qetufaqvr">
               <w:r>
                 <w:rPr>
                   <w:rFonts w:ascii="Arial" w:cs="Arial" w:eastAsia="Arial" w:hAnsi="Arial"/>
@@ -16924,7 +16906,7 @@
               <w:spacing w:after="10" w:before="0"/>
               <w:ind w:left="120"/>
             </w:pPr>
-            <w:hyperlink w:history="1" r:id="rIdxc0xy5r5ntbfhtmev79el">
+            <w:hyperlink w:history="1" r:id="rIddu9sb1kq6cahue2zimzug">
               <w:r>
                 <w:rPr>
                   <w:rFonts w:ascii="Arial" w:cs="Arial" w:eastAsia="Arial" w:hAnsi="Arial"/>
@@ -17132,7 +17114,7 @@
             <w:pPr>
               <w:spacing w:after="20" w:before="0"/>
             </w:pPr>
-            <w:hyperlink w:history="1" r:id="rIdxhkobem_uftuy-uzhk6lm">
+            <w:hyperlink w:history="1" r:id="rIdr0copnbste7cqdj-gnere">
               <w:r>
                 <w:rPr>
                   <w:rFonts w:ascii="Arial" w:cs="Arial" w:eastAsia="Arial" w:hAnsi="Arial"/>
@@ -17165,7 +17147,7 @@
               <w:spacing w:after="10" w:before="0"/>
               <w:ind w:left="120"/>
             </w:pPr>
-            <w:hyperlink w:history="1" r:id="rId8wmdzbxf3wtw-kl6ncp7m">
+            <w:hyperlink w:history="1" r:id="rIdxynlprcou3smnna94vr-z">
               <w:r>
                 <w:rPr>
                   <w:rFonts w:ascii="Arial" w:cs="Arial" w:eastAsia="Arial" w:hAnsi="Arial"/>
@@ -17210,7 +17192,7 @@
             <w:pPr>
               <w:spacing w:after="20" w:before="0"/>
             </w:pPr>
-            <w:hyperlink w:history="1" r:id="rIdjfu-4dkyvuerg-nrl19xs">
+            <w:hyperlink w:history="1" r:id="rIdcjcr8fspn4eaxq_dael9f">
               <w:r>
                 <w:rPr>
                   <w:rFonts w:ascii="Arial" w:cs="Arial" w:eastAsia="Arial" w:hAnsi="Arial"/>
@@ -17243,7 +17225,7 @@
               <w:spacing w:after="10" w:before="0"/>
               <w:ind w:left="120"/>
             </w:pPr>
-            <w:hyperlink w:history="1" r:id="rId8ohz6wslkxla8elqqrsdq">
+            <w:hyperlink w:history="1" r:id="rIdb1-euw4rb_brrbn-umtxa">
               <w:r>
                 <w:rPr>
                   <w:rFonts w:ascii="Arial" w:cs="Arial" w:eastAsia="Arial" w:hAnsi="Arial"/>
@@ -19022,7 +19004,7 @@
             <w:pPr>
               <w:spacing w:after="20" w:before="0"/>
             </w:pPr>
-            <w:hyperlink w:history="1" r:id="rIdn4ozyl2pwzji__oaaxy9f">
+            <w:hyperlink w:history="1" r:id="rIdtoto1mc9gkrhngxmnd--2">
               <w:r>
                 <w:rPr>
                   <w:rFonts w:ascii="Arial" w:cs="Arial" w:eastAsia="Arial" w:hAnsi="Arial"/>
@@ -19055,7 +19037,7 @@
               <w:spacing w:after="10" w:before="0"/>
               <w:ind w:left="120"/>
             </w:pPr>
-            <w:hyperlink w:history="1" r:id="rIdprikojlnm0bwxrai3g1bj">
+            <w:hyperlink w:history="1" r:id="rId4v9dcghlyv9rk9tkjqlni">
               <w:r>
                 <w:rPr>
                   <w:rFonts w:ascii="Arial" w:cs="Arial" w:eastAsia="Arial" w:hAnsi="Arial"/>
@@ -19100,7 +19082,7 @@
             <w:pPr>
               <w:spacing w:after="20" w:before="0"/>
             </w:pPr>
-            <w:hyperlink w:history="1" r:id="rIdcnnsuzkkqfuq3bnvoctf4">
+            <w:hyperlink w:history="1" r:id="rIduzdtxq-licoeitw9q33jd">
               <w:r>
                 <w:rPr>
                   <w:rFonts w:ascii="Arial" w:cs="Arial" w:eastAsia="Arial" w:hAnsi="Arial"/>
@@ -19133,7 +19115,7 @@
               <w:spacing w:after="10" w:before="0"/>
               <w:ind w:left="120"/>
             </w:pPr>
-            <w:hyperlink w:history="1" r:id="rIdgot0qes2qp9lcslrrzaid">
+            <w:hyperlink w:history="1" r:id="rIdw4tleh3q1sa33vy7ijmrm">
               <w:r>
                 <w:rPr>
                   <w:rFonts w:ascii="Arial" w:cs="Arial" w:eastAsia="Arial" w:hAnsi="Arial"/>
@@ -19341,7 +19323,7 @@
             <w:pPr>
               <w:spacing w:after="20" w:before="0"/>
             </w:pPr>
-            <w:hyperlink w:history="1" r:id="rId-_j-mmodfy9uamcxqkwzs">
+            <w:hyperlink w:history="1" r:id="rIde4hbz7l8lnlbfn5-gjeug">
               <w:r>
                 <w:rPr>
                   <w:rFonts w:ascii="Arial" w:cs="Arial" w:eastAsia="Arial" w:hAnsi="Arial"/>
@@ -19374,7 +19356,7 @@
               <w:spacing w:after="10" w:before="0"/>
               <w:ind w:left="120"/>
             </w:pPr>
-            <w:hyperlink w:history="1" r:id="rIdcqpwx16vgcznf5w19vqzo">
+            <w:hyperlink w:history="1" r:id="rId2uvtfsodf0exncm7pzs3e">
               <w:r>
                 <w:rPr>
                   <w:rFonts w:ascii="Arial" w:cs="Arial" w:eastAsia="Arial" w:hAnsi="Arial"/>
@@ -19419,7 +19401,7 @@
             <w:pPr>
               <w:spacing w:after="20" w:before="0"/>
             </w:pPr>
-            <w:hyperlink w:history="1" r:id="rIdvozhce-ynlpf9yvkgdlgs">
+            <w:hyperlink w:history="1" r:id="rId7_ew_gcxmsql-s8utfuvn">
               <w:r>
                 <w:rPr>
                   <w:rFonts w:ascii="Arial" w:cs="Arial" w:eastAsia="Arial" w:hAnsi="Arial"/>
@@ -19452,7 +19434,7 @@
               <w:spacing w:after="10" w:before="0"/>
               <w:ind w:left="120"/>
             </w:pPr>
-            <w:hyperlink w:history="1" r:id="rIdag9pmfmq1nbfaqjt-yoi3">
+            <w:hyperlink w:history="1" r:id="rIdglehwyziacd7rejwanyan">
               <w:r>
                 <w:rPr>
                   <w:rFonts w:ascii="Arial" w:cs="Arial" w:eastAsia="Arial" w:hAnsi="Arial"/>
@@ -19660,7 +19642,7 @@
             <w:pPr>
               <w:spacing w:after="20" w:before="0"/>
             </w:pPr>
-            <w:hyperlink w:history="1" r:id="rIdmrkzer0ntxiwnqzxr-cln">
+            <w:hyperlink w:history="1" r:id="rIdhi2gqnhozrfdpnyj4ctux">
               <w:r>
                 <w:rPr>
                   <w:rFonts w:ascii="Arial" w:cs="Arial" w:eastAsia="Arial" w:hAnsi="Arial"/>
@@ -19693,7 +19675,7 @@
               <w:spacing w:after="10" w:before="0"/>
               <w:ind w:left="120"/>
             </w:pPr>
-            <w:hyperlink w:history="1" r:id="rId0ofjsktuj1-9ybxa5n36w">
+            <w:hyperlink w:history="1" r:id="rId9scdo4hdwzcu4e4kkifqa">
               <w:r>
                 <w:rPr>
                   <w:rFonts w:ascii="Arial" w:cs="Arial" w:eastAsia="Arial" w:hAnsi="Arial"/>
@@ -19738,7 +19720,7 @@
             <w:pPr>
               <w:spacing w:after="20" w:before="0"/>
             </w:pPr>
-            <w:hyperlink w:history="1" r:id="rIdhcvic9fwnyuoyxnb0gfht">
+            <w:hyperlink w:history="1" r:id="rIdwivh5x9aay2rxcabl9dv8">
               <w:r>
                 <w:rPr>
                   <w:rFonts w:ascii="Arial" w:cs="Arial" w:eastAsia="Arial" w:hAnsi="Arial"/>
@@ -19771,7 +19753,7 @@
               <w:spacing w:after="10" w:before="0"/>
               <w:ind w:left="120"/>
             </w:pPr>
-            <w:hyperlink w:history="1" r:id="rId3qxcydzcbgnb8qndq57ml">
+            <w:hyperlink w:history="1" r:id="rId-zsdwh9xoiidmyeq82ijh">
               <w:r>
                 <w:rPr>
                   <w:rFonts w:ascii="Arial" w:cs="Arial" w:eastAsia="Arial" w:hAnsi="Arial"/>
@@ -19979,7 +19961,7 @@
             <w:pPr>
               <w:spacing w:after="20" w:before="0"/>
             </w:pPr>
-            <w:hyperlink w:history="1" r:id="rIdlwlixchcg78fkeejyvrfd">
+            <w:hyperlink w:history="1" r:id="rIdcg9rsub4x4gb4keqpxz4v">
               <w:r>
                 <w:rPr>
                   <w:rFonts w:ascii="Arial" w:cs="Arial" w:eastAsia="Arial" w:hAnsi="Arial"/>
@@ -20012,7 +19994,7 @@
               <w:spacing w:after="10" w:before="0"/>
               <w:ind w:left="120"/>
             </w:pPr>
-            <w:hyperlink w:history="1" r:id="rIdkyzl8yhzzxe4ml_20lhb7">
+            <w:hyperlink w:history="1" r:id="rIdtvl4vl3o-hji0a6udm4dh">
               <w:r>
                 <w:rPr>
                   <w:rFonts w:ascii="Arial" w:cs="Arial" w:eastAsia="Arial" w:hAnsi="Arial"/>
@@ -20057,7 +20039,7 @@
             <w:pPr>
               <w:spacing w:after="20" w:before="0"/>
             </w:pPr>
-            <w:hyperlink w:history="1" r:id="rIdajafdind0vwgnqdvdtj-f">
+            <w:hyperlink w:history="1" r:id="rId-tloc-sf8mim1rj2qbnkq">
               <w:r>
                 <w:rPr>
                   <w:rFonts w:ascii="Arial" w:cs="Arial" w:eastAsia="Arial" w:hAnsi="Arial"/>
@@ -20090,7 +20072,7 @@
               <w:spacing w:after="10" w:before="0"/>
               <w:ind w:left="120"/>
             </w:pPr>
-            <w:hyperlink w:history="1" r:id="rIdxf8osr2xfbklncycs2tor">
+            <w:hyperlink w:history="1" r:id="rIdnasoenpwiedejjf75uwbp">
               <w:r>
                 <w:rPr>
                   <w:rFonts w:ascii="Arial" w:cs="Arial" w:eastAsia="Arial" w:hAnsi="Arial"/>
@@ -20298,7 +20280,7 @@
             <w:pPr>
               <w:spacing w:after="20" w:before="0"/>
             </w:pPr>
-            <w:hyperlink w:history="1" r:id="rIdhtwblcxyr6wdox7-g16gi">
+            <w:hyperlink w:history="1" r:id="rIdowljdgks7luqr1vvoyogv">
               <w:r>
                 <w:rPr>
                   <w:rFonts w:ascii="Arial" w:cs="Arial" w:eastAsia="Arial" w:hAnsi="Arial"/>
@@ -20331,7 +20313,7 @@
               <w:spacing w:after="10" w:before="0"/>
               <w:ind w:left="120"/>
             </w:pPr>
-            <w:hyperlink w:history="1" r:id="rIdx3135rq9_yjzpzmq5n6u-">
+            <w:hyperlink w:history="1" r:id="rIdqedvtaxxnikgkuhgw30gz">
               <w:r>
                 <w:rPr>
                   <w:rFonts w:ascii="Arial" w:cs="Arial" w:eastAsia="Arial" w:hAnsi="Arial"/>
@@ -20376,7 +20358,7 @@
             <w:pPr>
               <w:spacing w:after="20" w:before="0"/>
             </w:pPr>
-            <w:hyperlink w:history="1" r:id="rIdywqnlmnt5cjlnzr9pi0vm">
+            <w:hyperlink w:history="1" r:id="rIdounup0qrpc-ig13labrr7">
               <w:r>
                 <w:rPr>
                   <w:rFonts w:ascii="Arial" w:cs="Arial" w:eastAsia="Arial" w:hAnsi="Arial"/>
@@ -20409,7 +20391,7 @@
               <w:spacing w:after="10" w:before="0"/>
               <w:ind w:left="120"/>
             </w:pPr>
-            <w:hyperlink w:history="1" r:id="rId2boed7byefxm15j6bc3ps">
+            <w:hyperlink w:history="1" r:id="rIdqyxijtoep6bxg9bvmnpbe">
               <w:r>
                 <w:rPr>
                   <w:rFonts w:ascii="Arial" w:cs="Arial" w:eastAsia="Arial" w:hAnsi="Arial"/>
@@ -22188,7 +22170,7 @@
             <w:pPr>
               <w:spacing w:after="20" w:before="0"/>
             </w:pPr>
-            <w:hyperlink w:history="1" r:id="rIdoradkg191dbrhcazxysp-">
+            <w:hyperlink w:history="1" r:id="rIdsnrjum4nuydp6g6nejxeh">
               <w:r>
                 <w:rPr>
                   <w:rFonts w:ascii="Arial" w:cs="Arial" w:eastAsia="Arial" w:hAnsi="Arial"/>
@@ -22221,7 +22203,7 @@
               <w:spacing w:after="10" w:before="0"/>
               <w:ind w:left="120"/>
             </w:pPr>
-            <w:hyperlink w:history="1" r:id="rIdbicccyk2eih84jbzaarnf">
+            <w:hyperlink w:history="1" r:id="rIdps-s-9xzapcmc9rbl_5rm">
               <w:r>
                 <w:rPr>
                   <w:rFonts w:ascii="Arial" w:cs="Arial" w:eastAsia="Arial" w:hAnsi="Arial"/>
@@ -22266,7 +22248,7 @@
             <w:pPr>
               <w:spacing w:after="20" w:before="0"/>
             </w:pPr>
-            <w:hyperlink w:history="1" r:id="rIdvxevpab0pb5zh9geiz9zs">
+            <w:hyperlink w:history="1" r:id="rIdbcrxkre4_yghvzu0sz7m6">
               <w:r>
                 <w:rPr>
                   <w:rFonts w:ascii="Arial" w:cs="Arial" w:eastAsia="Arial" w:hAnsi="Arial"/>
@@ -22299,7 +22281,7 @@
               <w:spacing w:after="10" w:before="0"/>
               <w:ind w:left="120"/>
             </w:pPr>
-            <w:hyperlink w:history="1" r:id="rIdwicohhtxgcian608eovuo">
+            <w:hyperlink w:history="1" r:id="rIdq5_lgxe-1rlyndbiee4rc">
               <w:r>
                 <w:rPr>
                   <w:rFonts w:ascii="Arial" w:cs="Arial" w:eastAsia="Arial" w:hAnsi="Arial"/>
@@ -22507,7 +22489,7 @@
             <w:pPr>
               <w:spacing w:after="20" w:before="0"/>
             </w:pPr>
-            <w:hyperlink w:history="1" r:id="rIdb7v9q5gywoljuyjb7_rhu">
+            <w:hyperlink w:history="1" r:id="rIdhjopuojxmkwi1myyvqtrc">
               <w:r>
                 <w:rPr>
                   <w:rFonts w:ascii="Arial" w:cs="Arial" w:eastAsia="Arial" w:hAnsi="Arial"/>
@@ -22540,7 +22522,7 @@
               <w:spacing w:after="10" w:before="0"/>
               <w:ind w:left="120"/>
             </w:pPr>
-            <w:hyperlink w:history="1" r:id="rId--xa6yymtgt-ct_5zp-p4">
+            <w:hyperlink w:history="1" r:id="rIdfz3kp0jpnml7ymmabs9gx">
               <w:r>
                 <w:rPr>
                   <w:rFonts w:ascii="Arial" w:cs="Arial" w:eastAsia="Arial" w:hAnsi="Arial"/>
@@ -22585,7 +22567,7 @@
             <w:pPr>
               <w:spacing w:after="20" w:before="0"/>
             </w:pPr>
-            <w:hyperlink w:history="1" r:id="rId1liy0ipq_64ajyekjois-">
+            <w:hyperlink w:history="1" r:id="rIdbnzylzepybvwotkahyfop">
               <w:r>
                 <w:rPr>
                   <w:rFonts w:ascii="Arial" w:cs="Arial" w:eastAsia="Arial" w:hAnsi="Arial"/>
@@ -22618,7 +22600,7 @@
               <w:spacing w:after="10" w:before="0"/>
               <w:ind w:left="120"/>
             </w:pPr>
-            <w:hyperlink w:history="1" r:id="rIdxg-drpkxwqrc-t4_1jh98">
+            <w:hyperlink w:history="1" r:id="rIdxatv672zmsguo7vdm7lx1">
               <w:r>
                 <w:rPr>
                   <w:rFonts w:ascii="Arial" w:cs="Arial" w:eastAsia="Arial" w:hAnsi="Arial"/>
@@ -22826,7 +22808,7 @@
             <w:pPr>
               <w:spacing w:after="20" w:before="0"/>
             </w:pPr>
-            <w:hyperlink w:history="1" r:id="rIdtembhmbhwgz6tygdyy4zi">
+            <w:hyperlink w:history="1" r:id="rIdt8ulcf4sgwwlmlv6se6hx">
               <w:r>
                 <w:rPr>
                   <w:rFonts w:ascii="Arial" w:cs="Arial" w:eastAsia="Arial" w:hAnsi="Arial"/>
@@ -22859,7 +22841,7 @@
               <w:spacing w:after="10" w:before="0"/>
               <w:ind w:left="120"/>
             </w:pPr>
-            <w:hyperlink w:history="1" r:id="rIdmxkyxpdx63a24ubyfhy_c">
+            <w:hyperlink w:history="1" r:id="rIdccadpd7sceve8_kfl3mos">
               <w:r>
                 <w:rPr>
                   <w:rFonts w:ascii="Arial" w:cs="Arial" w:eastAsia="Arial" w:hAnsi="Arial"/>
@@ -22904,7 +22886,7 @@
             <w:pPr>
               <w:spacing w:after="20" w:before="0"/>
             </w:pPr>
-            <w:hyperlink w:history="1" r:id="rIdn3tx0nlzkjpbtul-whgsb">
+            <w:hyperlink w:history="1" r:id="rIdfpsxn31yew4fgdos4xfsg">
               <w:r>
                 <w:rPr>
                   <w:rFonts w:ascii="Arial" w:cs="Arial" w:eastAsia="Arial" w:hAnsi="Arial"/>
@@ -22937,7 +22919,7 @@
               <w:spacing w:after="10" w:before="0"/>
               <w:ind w:left="120"/>
             </w:pPr>
-            <w:hyperlink w:history="1" r:id="rIdxzeq8liwj0qilhlnkd5vc">
+            <w:hyperlink w:history="1" r:id="rIdvr9bkamjgbu8wgb8ufbu1">
               <w:r>
                 <w:rPr>
                   <w:rFonts w:ascii="Arial" w:cs="Arial" w:eastAsia="Arial" w:hAnsi="Arial"/>
@@ -23145,7 +23127,7 @@
             <w:pPr>
               <w:spacing w:after="20" w:before="0"/>
             </w:pPr>
-            <w:hyperlink w:history="1" r:id="rIdyk_1i0s7yj4e3cu_898t8">
+            <w:hyperlink w:history="1" r:id="rIdlwnu76vu-7prax3sxbv4v">
               <w:r>
                 <w:rPr>
                   <w:rFonts w:ascii="Arial" w:cs="Arial" w:eastAsia="Arial" w:hAnsi="Arial"/>
@@ -23178,7 +23160,7 @@
               <w:spacing w:after="10" w:before="0"/>
               <w:ind w:left="120"/>
             </w:pPr>
-            <w:hyperlink w:history="1" r:id="rIdf3f8ivqlloxhkpvzhcmww">
+            <w:hyperlink w:history="1" r:id="rIdvd0aodrxclyujazuk2cgw">
               <w:r>
                 <w:rPr>
                   <w:rFonts w:ascii="Arial" w:cs="Arial" w:eastAsia="Arial" w:hAnsi="Arial"/>
@@ -23223,7 +23205,7 @@
             <w:pPr>
               <w:spacing w:after="20" w:before="0"/>
             </w:pPr>
-            <w:hyperlink w:history="1" r:id="rId0-uxrhrinb_v9h8vcfy_e">
+            <w:hyperlink w:history="1" r:id="rIduj9e_5ce2mgdwlnjeusns">
               <w:r>
                 <w:rPr>
                   <w:rFonts w:ascii="Arial" w:cs="Arial" w:eastAsia="Arial" w:hAnsi="Arial"/>
@@ -23256,7 +23238,7 @@
               <w:spacing w:after="10" w:before="0"/>
               <w:ind w:left="120"/>
             </w:pPr>
-            <w:hyperlink w:history="1" r:id="rIdlxhvuchk7ebumynqcc0kc">
+            <w:hyperlink w:history="1" r:id="rIdgikpjhhjlqozedm43uakr">
               <w:r>
                 <w:rPr>
                   <w:rFonts w:ascii="Arial" w:cs="Arial" w:eastAsia="Arial" w:hAnsi="Arial"/>
@@ -23464,7 +23446,7 @@
             <w:pPr>
               <w:spacing w:after="20" w:before="0"/>
             </w:pPr>
-            <w:hyperlink w:history="1" r:id="rIdhket4lyt37m1wp7rgu2fp">
+            <w:hyperlink w:history="1" r:id="rIdpschpprlnoobd1zqfqpqk">
               <w:r>
                 <w:rPr>
                   <w:rFonts w:ascii="Arial" w:cs="Arial" w:eastAsia="Arial" w:hAnsi="Arial"/>
@@ -23497,7 +23479,7 @@
               <w:spacing w:after="10" w:before="0"/>
               <w:ind w:left="120"/>
             </w:pPr>
-            <w:hyperlink w:history="1" r:id="rIdew2ewojivbnvf8rfeb_cr">
+            <w:hyperlink w:history="1" r:id="rIdaear92qoy-oxoqiekxjj2">
               <w:r>
                 <w:rPr>
                   <w:rFonts w:ascii="Arial" w:cs="Arial" w:eastAsia="Arial" w:hAnsi="Arial"/>
@@ -23542,7 +23524,7 @@
             <w:pPr>
               <w:spacing w:after="20" w:before="0"/>
             </w:pPr>
-            <w:hyperlink w:history="1" r:id="rIdzkb6noa17nkt75jndcoy-">
+            <w:hyperlink w:history="1" r:id="rIdh9t7tds6hplhyazausgib">
               <w:r>
                 <w:rPr>
                   <w:rFonts w:ascii="Arial" w:cs="Arial" w:eastAsia="Arial" w:hAnsi="Arial"/>
@@ -23575,7 +23557,7 @@
               <w:spacing w:after="10" w:before="0"/>
               <w:ind w:left="120"/>
             </w:pPr>
-            <w:hyperlink w:history="1" r:id="rIdgrbrv0_np40198vtmna-s">
+            <w:hyperlink w:history="1" r:id="rId3emff19eddrd52trcfuxv">
               <w:r>
                 <w:rPr>
                   <w:rFonts w:ascii="Arial" w:cs="Arial" w:eastAsia="Arial" w:hAnsi="Arial"/>
@@ -25354,7 +25336,7 @@
             <w:pPr>
               <w:spacing w:after="20" w:before="0"/>
             </w:pPr>
-            <w:hyperlink w:history="1" r:id="rIdimecoxhd8wqoacqwtzhrv">
+            <w:hyperlink w:history="1" r:id="rIdkiqw8zddt7ojfdovgfeif">
               <w:r>
                 <w:rPr>
                   <w:rFonts w:ascii="Arial" w:cs="Arial" w:eastAsia="Arial" w:hAnsi="Arial"/>
@@ -25387,7 +25369,7 @@
               <w:spacing w:after="10" w:before="0"/>
               <w:ind w:left="120"/>
             </w:pPr>
-            <w:hyperlink w:history="1" r:id="rId-ogkuedrlpcgcsmsndhif">
+            <w:hyperlink w:history="1" r:id="rId92ejalznzcgwdhytnxtws">
               <w:r>
                 <w:rPr>
                   <w:rFonts w:ascii="Arial" w:cs="Arial" w:eastAsia="Arial" w:hAnsi="Arial"/>
@@ -25432,7 +25414,7 @@
             <w:pPr>
               <w:spacing w:after="20" w:before="0"/>
             </w:pPr>
-            <w:hyperlink w:history="1" r:id="rIdmj9zncbnk2_qygkq8lf3n">
+            <w:hyperlink w:history="1" r:id="rIdvqn3l2wyzi_cv9sgmtvst">
               <w:r>
                 <w:rPr>
                   <w:rFonts w:ascii="Arial" w:cs="Arial" w:eastAsia="Arial" w:hAnsi="Arial"/>
@@ -25465,7 +25447,7 @@
               <w:spacing w:after="10" w:before="0"/>
               <w:ind w:left="120"/>
             </w:pPr>
-            <w:hyperlink w:history="1" r:id="rIdkg2elc-7lf8yx377e11ek">
+            <w:hyperlink w:history="1" r:id="rIdxi5h7worialq1ua4zdbme">
               <w:r>
                 <w:rPr>
                   <w:rFonts w:ascii="Arial" w:cs="Arial" w:eastAsia="Arial" w:hAnsi="Arial"/>
@@ -25673,7 +25655,7 @@
             <w:pPr>
               <w:spacing w:after="20" w:before="0"/>
             </w:pPr>
-            <w:hyperlink w:history="1" r:id="rId6zgthq1px2emolg8x4tdg">
+            <w:hyperlink w:history="1" r:id="rIdw44for472qkev2khn8yt9">
               <w:r>
                 <w:rPr>
                   <w:rFonts w:ascii="Arial" w:cs="Arial" w:eastAsia="Arial" w:hAnsi="Arial"/>
@@ -25706,7 +25688,7 @@
               <w:spacing w:after="10" w:before="0"/>
               <w:ind w:left="120"/>
             </w:pPr>
-            <w:hyperlink w:history="1" r:id="rIdp4zdc4k7ci3monvztfycz">
+            <w:hyperlink w:history="1" r:id="rId98nm0f8mgwklhg7cyuoss">
               <w:r>
                 <w:rPr>
                   <w:rFonts w:ascii="Arial" w:cs="Arial" w:eastAsia="Arial" w:hAnsi="Arial"/>
@@ -25751,7 +25733,7 @@
             <w:pPr>
               <w:spacing w:after="20" w:before="0"/>
             </w:pPr>
-            <w:hyperlink w:history="1" r:id="rIdyrfzy06kniogidqwzv18m">
+            <w:hyperlink w:history="1" r:id="rIdr0zhlu8j6wtuw35-e7ztf">
               <w:r>
                 <w:rPr>
                   <w:rFonts w:ascii="Arial" w:cs="Arial" w:eastAsia="Arial" w:hAnsi="Arial"/>
@@ -25784,7 +25766,7 @@
               <w:spacing w:after="10" w:before="0"/>
               <w:ind w:left="120"/>
             </w:pPr>
-            <w:hyperlink w:history="1" r:id="rIdla32qxqbxhooyjcdqded-">
+            <w:hyperlink w:history="1" r:id="rIdpublgnjxczdeb83odg5jr">
               <w:r>
                 <w:rPr>
                   <w:rFonts w:ascii="Arial" w:cs="Arial" w:eastAsia="Arial" w:hAnsi="Arial"/>
@@ -25992,7 +25974,7 @@
             <w:pPr>
               <w:spacing w:after="20" w:before="0"/>
             </w:pPr>
-            <w:hyperlink w:history="1" r:id="rId06xqhxnyles0vu0m_tr9w">
+            <w:hyperlink w:history="1" r:id="rIdlsekjdny8pclzwdjto4kf">
               <w:r>
                 <w:rPr>
                   <w:rFonts w:ascii="Arial" w:cs="Arial" w:eastAsia="Arial" w:hAnsi="Arial"/>
@@ -26025,7 +26007,7 @@
               <w:spacing w:after="10" w:before="0"/>
               <w:ind w:left="120"/>
             </w:pPr>
-            <w:hyperlink w:history="1" r:id="rIdnnwcnmbau0ooi8enlzh4e">
+            <w:hyperlink w:history="1" r:id="rIdkyg7nic4ynqnt1swjrrte">
               <w:r>
                 <w:rPr>
                   <w:rFonts w:ascii="Arial" w:cs="Arial" w:eastAsia="Arial" w:hAnsi="Arial"/>
@@ -26070,7 +26052,7 @@
             <w:pPr>
               <w:spacing w:after="20" w:before="0"/>
             </w:pPr>
-            <w:hyperlink w:history="1" r:id="rIdq2ry9r6bvckwsewodfy6v">
+            <w:hyperlink w:history="1" r:id="rIdldtt4esj2uk9rwzpsakg4">
               <w:r>
                 <w:rPr>
                   <w:rFonts w:ascii="Arial" w:cs="Arial" w:eastAsia="Arial" w:hAnsi="Arial"/>
@@ -26103,7 +26085,7 @@
               <w:spacing w:after="10" w:before="0"/>
               <w:ind w:left="120"/>
             </w:pPr>
-            <w:hyperlink w:history="1" r:id="rIddu3vfqegqj3y-tx8jcuz4">
+            <w:hyperlink w:history="1" r:id="rIdnz3gwdsiypc0nt_pqsgmi">
               <w:r>
                 <w:rPr>
                   <w:rFonts w:ascii="Arial" w:cs="Arial" w:eastAsia="Arial" w:hAnsi="Arial"/>
@@ -26311,7 +26293,7 @@
             <w:pPr>
               <w:spacing w:after="20" w:before="0"/>
             </w:pPr>
-            <w:hyperlink w:history="1" r:id="rIdte1bja6xrctgol42br1m_">
+            <w:hyperlink w:history="1" r:id="rIdi8d05o3jef2ixj30c5lxc">
               <w:r>
                 <w:rPr>
                   <w:rFonts w:ascii="Arial" w:cs="Arial" w:eastAsia="Arial" w:hAnsi="Arial"/>
@@ -26344,7 +26326,7 @@
               <w:spacing w:after="10" w:before="0"/>
               <w:ind w:left="120"/>
             </w:pPr>
-            <w:hyperlink w:history="1" r:id="rIdva56amntnuxfs7lxvc0p1">
+            <w:hyperlink w:history="1" r:id="rIdhoixv_1dyvgq-eauwcrjx">
               <w:r>
                 <w:rPr>
                   <w:rFonts w:ascii="Arial" w:cs="Arial" w:eastAsia="Arial" w:hAnsi="Arial"/>
@@ -26389,7 +26371,7 @@
             <w:pPr>
               <w:spacing w:after="20" w:before="0"/>
             </w:pPr>
-            <w:hyperlink w:history="1" r:id="rIdvpbgfqucvroov7zemubj8">
+            <w:hyperlink w:history="1" r:id="rIdtpj_gttio_vr6fj3id3gi">
               <w:r>
                 <w:rPr>
                   <w:rFonts w:ascii="Arial" w:cs="Arial" w:eastAsia="Arial" w:hAnsi="Arial"/>
@@ -26422,7 +26404,7 @@
               <w:spacing w:after="10" w:before="0"/>
               <w:ind w:left="120"/>
             </w:pPr>
-            <w:hyperlink w:history="1" r:id="rId_0pw1knbz2yvecffs6tlj">
+            <w:hyperlink w:history="1" r:id="rIdggy6njcln1ar5ugvchl7m">
               <w:r>
                 <w:rPr>
                   <w:rFonts w:ascii="Arial" w:cs="Arial" w:eastAsia="Arial" w:hAnsi="Arial"/>
@@ -26630,7 +26612,7 @@
             <w:pPr>
               <w:spacing w:after="20" w:before="0"/>
             </w:pPr>
-            <w:hyperlink w:history="1" r:id="rIdrd4aqx6ssq1cgz07dp5mc">
+            <w:hyperlink w:history="1" r:id="rIdu4osiuuk8kbbsiooynxna">
               <w:r>
                 <w:rPr>
                   <w:rFonts w:ascii="Arial" w:cs="Arial" w:eastAsia="Arial" w:hAnsi="Arial"/>
@@ -26663,7 +26645,7 @@
               <w:spacing w:after="10" w:before="0"/>
               <w:ind w:left="120"/>
             </w:pPr>
-            <w:hyperlink w:history="1" r:id="rId6cyndpduw8trdz2epzs_q">
+            <w:hyperlink w:history="1" r:id="rIdmu-rhjmir6dajwipmh4tq">
               <w:r>
                 <w:rPr>
                   <w:rFonts w:ascii="Arial" w:cs="Arial" w:eastAsia="Arial" w:hAnsi="Arial"/>
@@ -26708,7 +26690,7 @@
             <w:pPr>
               <w:spacing w:after="20" w:before="0"/>
             </w:pPr>
-            <w:hyperlink w:history="1" r:id="rId5pva5375e4tveuu0brjmr">
+            <w:hyperlink w:history="1" r:id="rIdcwg-9bl0ljjj1f1scl5i0">
               <w:r>
                 <w:rPr>
                   <w:rFonts w:ascii="Arial" w:cs="Arial" w:eastAsia="Arial" w:hAnsi="Arial"/>
@@ -26741,7 +26723,7 @@
               <w:spacing w:after="10" w:before="0"/>
               <w:ind w:left="120"/>
             </w:pPr>
-            <w:hyperlink w:history="1" r:id="rIdjtzljgjcsrxu2o7vchtp2">
+            <w:hyperlink w:history="1" r:id="rIdvtujs5evkowrtt2z0pegm">
               <w:r>
                 <w:rPr>
                   <w:rFonts w:ascii="Arial" w:cs="Arial" w:eastAsia="Arial" w:hAnsi="Arial"/>

</xml_diff>